<commit_message>
added set in new way of study
</commit_message>
<xml_diff>
--- a/TheorynCoding/Study Material/Java Overall/Java Overall/Quick Java/oza sir/New Way of Study/Collection Long Way.docx
+++ b/TheorynCoding/Study Material/Java Overall/Java Overall/Quick Java/oza sir/New Way of Study/Collection Long Way.docx
@@ -823,6 +823,32 @@
           <w:lang w:eastAsia="en-IN"/>
         </w:rPr>
       </w:pPr>
+      <w:r>
+        <w:rPr>
+          <w:rFonts w:ascii="Times New Roman" w:eastAsia="Times New Roman" w:hAnsi="Times New Roman" w:cs="Times New Roman"/>
+          <w:b/>
+          <w:bCs/>
+          <w:kern w:val="36"/>
+          <w:sz w:val="48"/>
+          <w:szCs w:val="48"/>
+          <w:highlight w:val="red"/>
+          <w:lang w:eastAsia="en-IN"/>
+        </w:rPr>
+        <w:t>2.1</w:t>
+      </w:r>
+      <w:r>
+        <w:rPr>
+          <w:rFonts w:ascii="Times New Roman" w:eastAsia="Times New Roman" w:hAnsi="Times New Roman" w:cs="Times New Roman"/>
+          <w:b/>
+          <w:bCs/>
+          <w:kern w:val="36"/>
+          <w:sz w:val="48"/>
+          <w:szCs w:val="48"/>
+          <w:highlight w:val="red"/>
+          <w:lang w:eastAsia="en-IN"/>
+        </w:rPr>
+        <w:t xml:space="preserve"> </w:t>
+      </w:r>
       <w:proofErr w:type="spellStart"/>
       <w:r>
         <w:rPr>
@@ -2323,7 +2349,6 @@
           <w:lang w:eastAsia="en-IN"/>
         </w:rPr>
       </w:pPr>
-      <w:proofErr w:type="spellStart"/>
       <w:r>
         <w:rPr>
           <w:rFonts w:ascii="Times New Roman" w:eastAsia="Times New Roman" w:hAnsi="Times New Roman" w:cs="Times New Roman"/>
@@ -2335,1564 +2360,9 @@
           <w:highlight w:val="red"/>
           <w:lang w:eastAsia="en-IN"/>
         </w:rPr>
-        <w:t>LinkedList</w:t>
-      </w:r>
-      <w:proofErr w:type="spellEnd"/>
-    </w:p>
-    <w:p>
-      <w:pPr>
-        <w:pStyle w:val="Heading3"/>
-      </w:pPr>
-      <w:r>
-        <w:t>Definition</w:t>
-      </w:r>
-    </w:p>
-    <w:p>
-      <w:pPr>
-        <w:pStyle w:val="NormalWeb"/>
-      </w:pPr>
-      <w:proofErr w:type="spellStart"/>
-      <w:r>
-        <w:t>LinkedList</w:t>
-      </w:r>
-      <w:proofErr w:type="spellEnd"/>
-      <w:r>
-        <w:t xml:space="preserve"> is a class that implements the List interface using a doubly linked list.</w:t>
-      </w:r>
-    </w:p>
-    <w:p>
-      <w:pPr>
-        <w:pStyle w:val="Heading3"/>
-      </w:pPr>
-      <w:r>
-        <w:t>Follows List Rules</w:t>
-      </w:r>
-    </w:p>
-    <w:p>
-      <w:pPr>
-        <w:pStyle w:val="HTMLPreformatted"/>
-      </w:pPr>
-      <w:r>
-        <w:rPr>
-          <w:rStyle w:val="HTMLCode"/>
-        </w:rPr>
-        <w:t>Order      ✅</w:t>
-      </w:r>
-      <w:r>
-        <w:br/>
-      </w:r>
-      <w:proofErr w:type="gramStart"/>
-      <w:r>
-        <w:rPr>
-          <w:rStyle w:val="HTMLCode"/>
-        </w:rPr>
-        <w:t>Duplicate  ✅</w:t>
-      </w:r>
-      <w:proofErr w:type="gramEnd"/>
-      <w:r>
-        <w:rPr>
-          <w:rStyle w:val="HTMLCode"/>
-        </w:rPr>
-        <w:t xml:space="preserve"> Unlimited</w:t>
-      </w:r>
-      <w:r>
-        <w:br/>
-      </w:r>
-      <w:r>
-        <w:rPr>
-          <w:rStyle w:val="HTMLCode"/>
-        </w:rPr>
-        <w:t>Null       ✅ Unlimited</w:t>
-      </w:r>
-      <w:r>
-        <w:br/>
-      </w:r>
-      <w:r>
-        <w:rPr>
-          <w:rStyle w:val="HTMLCode"/>
-        </w:rPr>
-        <w:t>Index      ✅</w:t>
-      </w:r>
-    </w:p>
-    <w:p>
-      <w:pPr>
-        <w:pStyle w:val="Heading3"/>
-      </w:pPr>
-      <w:r>
-        <w:lastRenderedPageBreak/>
-        <w:t>Internal Working</w:t>
-      </w:r>
-    </w:p>
-    <w:p>
-      <w:pPr>
-        <w:pStyle w:val="HTMLPreformatted"/>
-      </w:pPr>
-      <w:r>
-        <w:rPr>
-          <w:rStyle w:val="HTMLCode"/>
-        </w:rPr>
-        <w:t>Head</w:t>
-      </w:r>
-      <w:r>
-        <w:br/>
-      </w:r>
-      <w:r>
-        <w:rPr>
-          <w:rStyle w:val="HTMLCode"/>
-        </w:rPr>
-        <w:t xml:space="preserve"> </w:t>
-      </w:r>
-      <w:proofErr w:type="gramStart"/>
-      <w:r>
-        <w:rPr>
-          <w:rStyle w:val="HTMLCode"/>
-        </w:rPr>
-        <w:t>↓</w:t>
-      </w:r>
-      <w:proofErr w:type="gramEnd"/>
-      <w:r>
-        <w:br/>
-      </w:r>
-      <w:r>
-        <w:rPr>
-          <w:rStyle w:val="HTMLCode"/>
-        </w:rPr>
-        <w:t xml:space="preserve">[Rahul] </w:t>
-      </w:r>
-      <w:r>
-        <w:rPr>
-          <w:rStyle w:val="HTMLCode"/>
-          <w:rFonts w:ascii="Cambria Math" w:hAnsi="Cambria Math" w:cs="Cambria Math"/>
-        </w:rPr>
-        <w:t>⇄</w:t>
-      </w:r>
-      <w:r>
-        <w:rPr>
-          <w:rStyle w:val="HTMLCode"/>
-        </w:rPr>
-        <w:t xml:space="preserve"> [Amit] </w:t>
-      </w:r>
-      <w:r>
-        <w:rPr>
-          <w:rStyle w:val="HTMLCode"/>
-          <w:rFonts w:ascii="Cambria Math" w:hAnsi="Cambria Math" w:cs="Cambria Math"/>
-        </w:rPr>
-        <w:t>⇄</w:t>
-      </w:r>
-      <w:r>
-        <w:rPr>
-          <w:rStyle w:val="HTMLCode"/>
-        </w:rPr>
-        <w:t xml:space="preserve"> [</w:t>
-      </w:r>
-      <w:proofErr w:type="spellStart"/>
-      <w:r>
-        <w:rPr>
-          <w:rStyle w:val="HTMLCode"/>
-        </w:rPr>
-        <w:t>Neha</w:t>
-      </w:r>
-      <w:proofErr w:type="spellEnd"/>
-      <w:r>
-        <w:rPr>
-          <w:rStyle w:val="HTMLCode"/>
-        </w:rPr>
-        <w:t xml:space="preserve">] </w:t>
-      </w:r>
-      <w:r>
-        <w:rPr>
-          <w:rStyle w:val="HTMLCode"/>
-          <w:rFonts w:ascii="Cambria Math" w:hAnsi="Cambria Math" w:cs="Cambria Math"/>
-        </w:rPr>
-        <w:t>⇄</w:t>
-      </w:r>
-      <w:r>
-        <w:rPr>
-          <w:rStyle w:val="HTMLCode"/>
-        </w:rPr>
-        <w:t xml:space="preserve"> [null]</w:t>
-      </w:r>
-      <w:r>
-        <w:br/>
-      </w:r>
-      <w:r>
-        <w:rPr>
-          <w:rStyle w:val="HTMLCode"/>
-        </w:rPr>
-        <w:t xml:space="preserve">                                ↑</w:t>
-      </w:r>
-      <w:r>
-        <w:br/>
-      </w:r>
-      <w:r>
-        <w:rPr>
-          <w:rStyle w:val="HTMLCode"/>
-        </w:rPr>
-        <w:t xml:space="preserve">                              Tail</w:t>
-      </w:r>
-    </w:p>
-    <w:p>
-      <w:pPr>
-        <w:pStyle w:val="NormalWeb"/>
-      </w:pPr>
-      <w:r>
-        <w:t>Each node contains:</w:t>
-      </w:r>
-    </w:p>
-    <w:p>
-      <w:pPr>
-        <w:pStyle w:val="HTMLPreformatted"/>
-      </w:pPr>
-      <w:r>
-        <w:rPr>
-          <w:rStyle w:val="HTMLCode"/>
-        </w:rPr>
-        <w:t>Data</w:t>
-      </w:r>
-      <w:r>
-        <w:br/>
-      </w:r>
-      <w:r>
-        <w:rPr>
-          <w:rStyle w:val="HTMLCode"/>
-        </w:rPr>
-        <w:t>Previous Reference</w:t>
-      </w:r>
-      <w:r>
-        <w:br/>
-      </w:r>
-      <w:r>
-        <w:rPr>
-          <w:rStyle w:val="HTMLCode"/>
-        </w:rPr>
-        <w:t>Next Reference</w:t>
-      </w:r>
-    </w:p>
-    <w:p>
-      <w:pPr>
-        <w:pStyle w:val="NormalWeb"/>
-      </w:pPr>
-      <w:r>
-        <w:t>Example:</w:t>
-      </w:r>
-    </w:p>
-    <w:p>
-      <w:pPr>
-        <w:pStyle w:val="HTMLPreformatted"/>
-      </w:pPr>
-      <w:r>
-        <w:rPr>
-          <w:rStyle w:val="HTMLCode"/>
-        </w:rPr>
-        <w:t>[Amit Node]</w:t>
-      </w:r>
-      <w:r>
-        <w:br/>
-      </w:r>
-      <w:r>
-        <w:br/>
-      </w:r>
-      <w:r>
-        <w:rPr>
-          <w:rStyle w:val="HTMLCode"/>
-        </w:rPr>
-        <w:t>Data = Amit</w:t>
-      </w:r>
-      <w:r>
-        <w:br/>
-      </w:r>
-      <w:proofErr w:type="spellStart"/>
-      <w:r>
-        <w:rPr>
-          <w:rStyle w:val="HTMLCode"/>
-        </w:rPr>
-        <w:t>Prev</w:t>
-      </w:r>
-      <w:proofErr w:type="spellEnd"/>
-      <w:r>
-        <w:rPr>
-          <w:rStyle w:val="HTMLCode"/>
-        </w:rPr>
-        <w:t xml:space="preserve"> = Rahul</w:t>
-      </w:r>
-      <w:r>
-        <w:br/>
-      </w:r>
-      <w:r>
-        <w:rPr>
-          <w:rStyle w:val="HTMLCode"/>
-        </w:rPr>
-        <w:t xml:space="preserve">Next = </w:t>
-      </w:r>
-      <w:proofErr w:type="spellStart"/>
-      <w:r>
-        <w:rPr>
-          <w:rStyle w:val="HTMLCode"/>
-        </w:rPr>
-        <w:t>Neha</w:t>
-      </w:r>
-      <w:proofErr w:type="spellEnd"/>
-    </w:p>
-    <w:p>
-      <w:pPr>
-        <w:pStyle w:val="Heading3"/>
-      </w:pPr>
-      <w:r>
-        <w:t xml:space="preserve">How </w:t>
-      </w:r>
-      <w:proofErr w:type="gramStart"/>
-      <w:r>
-        <w:t>get(</w:t>
-      </w:r>
-      <w:proofErr w:type="gramEnd"/>
-      <w:r>
-        <w:t>2) Works?</w:t>
-      </w:r>
-    </w:p>
-    <w:p>
-      <w:pPr>
-        <w:pStyle w:val="HTMLPreformatted"/>
-      </w:pPr>
-      <w:proofErr w:type="spellStart"/>
-      <w:proofErr w:type="gramStart"/>
-      <w:r>
-        <w:rPr>
-          <w:rStyle w:val="m"/>
-        </w:rPr>
-        <w:t>list</w:t>
-      </w:r>
-      <w:r>
-        <w:rPr>
-          <w:rStyle w:val="g"/>
-        </w:rPr>
-        <w:t>.</w:t>
-      </w:r>
-      <w:r>
-        <w:rPr>
-          <w:rStyle w:val="m"/>
-        </w:rPr>
-        <w:t>get</w:t>
-      </w:r>
-      <w:proofErr w:type="spellEnd"/>
-      <w:r>
-        <w:rPr>
-          <w:rStyle w:val="HTMLCode"/>
-        </w:rPr>
-        <w:t>(</w:t>
-      </w:r>
-      <w:proofErr w:type="gramEnd"/>
-      <w:r>
-        <w:rPr>
-          <w:rStyle w:val="j"/>
-        </w:rPr>
-        <w:t>2</w:t>
-      </w:r>
-      <w:r>
-        <w:rPr>
-          <w:rStyle w:val="HTMLCode"/>
-        </w:rPr>
-        <w:t>);</w:t>
-      </w:r>
-    </w:p>
-    <w:p>
-      <w:pPr>
-        <w:pStyle w:val="NormalWeb"/>
-      </w:pPr>
-      <w:r>
-        <w:lastRenderedPageBreak/>
-        <w:t>Internally:</w:t>
-      </w:r>
-    </w:p>
-    <w:p>
-      <w:pPr>
-        <w:pStyle w:val="HTMLPreformatted"/>
-      </w:pPr>
-      <w:r>
-        <w:rPr>
-          <w:rStyle w:val="HTMLCode"/>
-        </w:rPr>
-        <w:t xml:space="preserve">Rahul → Amit → </w:t>
-      </w:r>
-      <w:proofErr w:type="spellStart"/>
-      <w:r>
-        <w:rPr>
-          <w:rStyle w:val="HTMLCode"/>
-        </w:rPr>
-        <w:t>Neha</w:t>
-      </w:r>
-      <w:proofErr w:type="spellEnd"/>
-    </w:p>
-    <w:p>
-      <w:pPr>
-        <w:pStyle w:val="NormalWeb"/>
-      </w:pPr>
-      <w:proofErr w:type="gramStart"/>
-      <w:r>
-        <w:t>Traverses node by node until index 2.</w:t>
-      </w:r>
-      <w:proofErr w:type="gramEnd"/>
-    </w:p>
-    <w:p>
-      <w:r>
-        <w:pict>
-          <v:rect id="_x0000_i1026" style="width:0;height:1.5pt" o:hralign="center" o:hrstd="t" o:hr="t" fillcolor="#a0a0a0" stroked="f"/>
-        </w:pict>
-      </w:r>
-    </w:p>
-    <w:p>
-      <w:pPr>
-        <w:pStyle w:val="Heading3"/>
-      </w:pPr>
-      <w:r>
-        <w:t>How Insert Works?</w:t>
-      </w:r>
-    </w:p>
-    <w:p>
-      <w:pPr>
-        <w:pStyle w:val="NormalWeb"/>
-      </w:pPr>
-      <w:r>
-        <w:t>Before:</w:t>
-      </w:r>
-    </w:p>
-    <w:p>
-      <w:pPr>
-        <w:pStyle w:val="HTMLPreformatted"/>
-      </w:pPr>
-      <w:r>
-        <w:rPr>
-          <w:rStyle w:val="HTMLCode"/>
-        </w:rPr>
-        <w:t xml:space="preserve">A </w:t>
-      </w:r>
-      <w:r>
-        <w:rPr>
-          <w:rStyle w:val="HTMLCode"/>
-          <w:rFonts w:ascii="Cambria Math" w:hAnsi="Cambria Math" w:cs="Cambria Math"/>
-        </w:rPr>
-        <w:t>⇄</w:t>
-      </w:r>
-      <w:r>
-        <w:rPr>
-          <w:rStyle w:val="HTMLCode"/>
-        </w:rPr>
-        <w:t xml:space="preserve"> B </w:t>
-      </w:r>
-      <w:r>
-        <w:rPr>
-          <w:rStyle w:val="HTMLCode"/>
-          <w:rFonts w:ascii="Cambria Math" w:hAnsi="Cambria Math" w:cs="Cambria Math"/>
-        </w:rPr>
-        <w:t>⇄</w:t>
-      </w:r>
-      <w:r>
-        <w:rPr>
-          <w:rStyle w:val="HTMLCode"/>
-        </w:rPr>
-        <w:t xml:space="preserve"> C</w:t>
-      </w:r>
-    </w:p>
-    <w:p>
-      <w:pPr>
-        <w:pStyle w:val="NormalWeb"/>
-      </w:pPr>
-      <w:r>
-        <w:t>Insert X:</w:t>
-      </w:r>
-    </w:p>
-    <w:p>
-      <w:pPr>
-        <w:pStyle w:val="HTMLPreformatted"/>
-      </w:pPr>
-      <w:r>
-        <w:rPr>
-          <w:rStyle w:val="HTMLCode"/>
-        </w:rPr>
-        <w:t xml:space="preserve">A </w:t>
-      </w:r>
-      <w:r>
-        <w:rPr>
-          <w:rStyle w:val="HTMLCode"/>
-          <w:rFonts w:ascii="Cambria Math" w:hAnsi="Cambria Math" w:cs="Cambria Math"/>
-        </w:rPr>
-        <w:t>⇄</w:t>
-      </w:r>
-      <w:r>
-        <w:rPr>
-          <w:rStyle w:val="HTMLCode"/>
-        </w:rPr>
-        <w:t xml:space="preserve"> X </w:t>
-      </w:r>
-      <w:r>
-        <w:rPr>
-          <w:rStyle w:val="HTMLCode"/>
-          <w:rFonts w:ascii="Cambria Math" w:hAnsi="Cambria Math" w:cs="Cambria Math"/>
-        </w:rPr>
-        <w:t>⇄</w:t>
-      </w:r>
-      <w:r>
-        <w:rPr>
-          <w:rStyle w:val="HTMLCode"/>
-        </w:rPr>
-        <w:t xml:space="preserve"> B </w:t>
-      </w:r>
-      <w:r>
-        <w:rPr>
-          <w:rStyle w:val="HTMLCode"/>
-          <w:rFonts w:ascii="Cambria Math" w:hAnsi="Cambria Math" w:cs="Cambria Math"/>
-        </w:rPr>
-        <w:t>⇄</w:t>
-      </w:r>
-      <w:r>
-        <w:rPr>
-          <w:rStyle w:val="HTMLCode"/>
-        </w:rPr>
-        <w:t xml:space="preserve"> C</w:t>
-      </w:r>
-    </w:p>
-    <w:p>
-      <w:pPr>
-        <w:pStyle w:val="NormalWeb"/>
-      </w:pPr>
-      <w:r>
-        <w:t>No shifting.</w:t>
-      </w:r>
-    </w:p>
-    <w:p>
-      <w:pPr>
-        <w:pStyle w:val="NormalWeb"/>
-      </w:pPr>
-      <w:r>
-        <w:t>Only references are updated.</w:t>
-      </w:r>
-    </w:p>
-    <w:p>
-      <w:r>
-        <w:pict>
-          <v:rect id="_x0000_i1027" style="width:0;height:1.5pt" o:hralign="center" o:hrstd="t" o:hr="t" fillcolor="#a0a0a0" stroked="f"/>
-        </w:pict>
-      </w:r>
-    </w:p>
-    <w:p>
-      <w:pPr>
-        <w:pStyle w:val="Heading3"/>
-      </w:pPr>
-      <w:r>
-        <w:lastRenderedPageBreak/>
-        <w:t>How Delete Works?</w:t>
-      </w:r>
-    </w:p>
-    <w:p>
-      <w:pPr>
-        <w:pStyle w:val="NormalWeb"/>
-      </w:pPr>
-      <w:r>
-        <w:t>Before:</w:t>
-      </w:r>
-    </w:p>
-    <w:p>
-      <w:pPr>
-        <w:pStyle w:val="HTMLPreformatted"/>
-      </w:pPr>
-      <w:r>
-        <w:rPr>
-          <w:rStyle w:val="HTMLCode"/>
-        </w:rPr>
-        <w:t xml:space="preserve">A </w:t>
-      </w:r>
-      <w:r>
-        <w:rPr>
-          <w:rStyle w:val="HTMLCode"/>
-          <w:rFonts w:ascii="Cambria Math" w:hAnsi="Cambria Math" w:cs="Cambria Math"/>
-        </w:rPr>
-        <w:t>⇄</w:t>
-      </w:r>
-      <w:r>
-        <w:rPr>
-          <w:rStyle w:val="HTMLCode"/>
-        </w:rPr>
-        <w:t xml:space="preserve"> B </w:t>
-      </w:r>
-      <w:r>
-        <w:rPr>
-          <w:rStyle w:val="HTMLCode"/>
-          <w:rFonts w:ascii="Cambria Math" w:hAnsi="Cambria Math" w:cs="Cambria Math"/>
-        </w:rPr>
-        <w:t>⇄</w:t>
-      </w:r>
-      <w:r>
-        <w:rPr>
-          <w:rStyle w:val="HTMLCode"/>
-        </w:rPr>
-        <w:t xml:space="preserve"> C</w:t>
-      </w:r>
-    </w:p>
-    <w:p>
-      <w:pPr>
-        <w:pStyle w:val="NormalWeb"/>
-      </w:pPr>
-      <w:r>
-        <w:t>Remove B:</w:t>
-      </w:r>
-    </w:p>
-    <w:p>
-      <w:pPr>
-        <w:pStyle w:val="HTMLPreformatted"/>
-      </w:pPr>
-      <w:r>
-        <w:rPr>
-          <w:rStyle w:val="HTMLCode"/>
-        </w:rPr>
-        <w:t xml:space="preserve">A </w:t>
-      </w:r>
-      <w:r>
-        <w:rPr>
-          <w:rStyle w:val="HTMLCode"/>
-          <w:rFonts w:ascii="Cambria Math" w:hAnsi="Cambria Math" w:cs="Cambria Math"/>
-        </w:rPr>
-        <w:t>⇄</w:t>
-      </w:r>
-      <w:r>
-        <w:rPr>
-          <w:rStyle w:val="HTMLCode"/>
-        </w:rPr>
-        <w:t xml:space="preserve"> C</w:t>
-      </w:r>
-    </w:p>
-    <w:p>
-      <w:pPr>
-        <w:pStyle w:val="NormalWeb"/>
-      </w:pPr>
-      <w:r>
-        <w:t>Again, only references are updated.</w:t>
-      </w:r>
-    </w:p>
-    <w:p>
-      <w:r>
-        <w:pict>
-          <v:rect id="_x0000_i1028" style="width:0;height:1.5pt" o:hralign="center" o:hrstd="t" o:hr="t" fillcolor="#a0a0a0" stroked="f"/>
-        </w:pict>
-      </w:r>
-    </w:p>
-    <w:p>
-      <w:pPr>
-        <w:pStyle w:val="Heading3"/>
-      </w:pPr>
-      <w:r>
-        <w:t>Performance</w:t>
-      </w:r>
-    </w:p>
-    <w:p>
-      <w:pPr>
-        <w:pStyle w:val="HTMLPreformatted"/>
-      </w:pPr>
-      <w:proofErr w:type="gramStart"/>
-      <w:r>
-        <w:rPr>
-          <w:rStyle w:val="HTMLCode"/>
-        </w:rPr>
-        <w:t>get(</w:t>
-      </w:r>
-      <w:proofErr w:type="gramEnd"/>
-      <w:r>
-        <w:rPr>
-          <w:rStyle w:val="HTMLCode"/>
-        </w:rPr>
-        <w:t>)      O(n)</w:t>
-      </w:r>
-      <w:r>
-        <w:br/>
-      </w:r>
-      <w:r>
-        <w:rPr>
-          <w:rStyle w:val="HTMLCode"/>
-        </w:rPr>
-        <w:t>add()      O(1)*</w:t>
-      </w:r>
-      <w:r>
-        <w:br/>
-      </w:r>
-      <w:r>
-        <w:rPr>
-          <w:rStyle w:val="HTMLCode"/>
-        </w:rPr>
-        <w:t>remove()   O(1)*</w:t>
-      </w:r>
-    </w:p>
-    <w:p>
-      <w:pPr>
-        <w:pStyle w:val="Heading3"/>
-      </w:pPr>
-      <w:r>
-        <w:t>Interview One-Liner</w:t>
-      </w:r>
-    </w:p>
-    <w:p>
-      <w:pPr>
-        <w:pStyle w:val="NormalWeb"/>
-        <w:rPr>
-          <w:rStyle w:val="Strong"/>
-        </w:rPr>
-      </w:pPr>
-      <w:proofErr w:type="spellStart"/>
-      <w:r>
-        <w:rPr>
-          <w:rStyle w:val="Strong"/>
-        </w:rPr>
-        <w:lastRenderedPageBreak/>
-        <w:t>LinkedList</w:t>
-      </w:r>
-      <w:proofErr w:type="spellEnd"/>
-      <w:r>
-        <w:rPr>
-          <w:rStyle w:val="Strong"/>
-        </w:rPr>
-        <w:t xml:space="preserve"> is a doubly linked list implementation of List that maintains insertion order, allows unlimited duplicates and null values, supports index-based access, stores data in nodes connected by previous and next references, and provides fast insertion and deletion without shifting elements.</w:t>
-      </w:r>
-    </w:p>
-    <w:p>
-      <w:pPr>
-        <w:spacing w:before="100" w:beforeAutospacing="1" w:after="100" w:afterAutospacing="1" w:line="240" w:lineRule="auto"/>
-        <w:rPr>
-          <w:rFonts w:ascii="Times New Roman" w:eastAsia="Times New Roman" w:hAnsi="Times New Roman" w:cs="Times New Roman"/>
-          <w:sz w:val="24"/>
-          <w:szCs w:val="24"/>
-          <w:lang w:eastAsia="en-IN"/>
-        </w:rPr>
-      </w:pPr>
-      <w:r>
-        <w:rPr>
-          <w:rFonts w:ascii="Times New Roman" w:eastAsia="Times New Roman" w:hAnsi="Times New Roman" w:cs="Times New Roman"/>
-          <w:b/>
-          <w:bCs/>
-          <w:sz w:val="24"/>
-          <w:szCs w:val="24"/>
-          <w:lang w:eastAsia="en-IN"/>
-        </w:rPr>
-        <w:t xml:space="preserve">How does </w:t>
-      </w:r>
-      <w:proofErr w:type="spellStart"/>
-      <w:r>
-        <w:rPr>
-          <w:rFonts w:ascii="Times New Roman" w:eastAsia="Times New Roman" w:hAnsi="Times New Roman" w:cs="Times New Roman"/>
-          <w:b/>
-          <w:bCs/>
-          <w:sz w:val="24"/>
-          <w:szCs w:val="24"/>
-          <w:lang w:eastAsia="en-IN"/>
-        </w:rPr>
-        <w:t>LinkedList</w:t>
-      </w:r>
-      <w:proofErr w:type="spellEnd"/>
-      <w:r>
-        <w:rPr>
-          <w:rFonts w:ascii="Times New Roman" w:eastAsia="Times New Roman" w:hAnsi="Times New Roman" w:cs="Times New Roman"/>
-          <w:b/>
-          <w:bCs/>
-          <w:sz w:val="24"/>
-          <w:szCs w:val="24"/>
-          <w:lang w:eastAsia="en-IN"/>
-        </w:rPr>
-        <w:t xml:space="preserve"> increase its size?</w:t>
-      </w:r>
-    </w:p>
-    <w:p>
-      <w:pPr>
-        <w:spacing w:beforeAutospacing="1" w:after="100" w:afterAutospacing="1" w:line="240" w:lineRule="auto"/>
-        <w:rPr>
-          <w:rFonts w:ascii="Times New Roman" w:eastAsia="Times New Roman" w:hAnsi="Times New Roman" w:cs="Times New Roman"/>
-          <w:sz w:val="24"/>
-          <w:szCs w:val="24"/>
-          <w:lang w:eastAsia="en-IN"/>
-        </w:rPr>
-      </w:pPr>
-      <w:proofErr w:type="spellStart"/>
-      <w:r>
-        <w:rPr>
-          <w:rFonts w:ascii="Times New Roman" w:eastAsia="Times New Roman" w:hAnsi="Times New Roman" w:cs="Times New Roman"/>
-          <w:sz w:val="24"/>
-          <w:szCs w:val="24"/>
-          <w:lang w:eastAsia="en-IN"/>
-        </w:rPr>
-        <w:t>LinkedList</w:t>
-      </w:r>
-      <w:proofErr w:type="spellEnd"/>
-      <w:r>
-        <w:rPr>
-          <w:rFonts w:ascii="Times New Roman" w:eastAsia="Times New Roman" w:hAnsi="Times New Roman" w:cs="Times New Roman"/>
-          <w:sz w:val="24"/>
-          <w:szCs w:val="24"/>
-          <w:lang w:eastAsia="en-IN"/>
-        </w:rPr>
-        <w:t xml:space="preserve"> does not resize like </w:t>
-      </w:r>
-      <w:proofErr w:type="spellStart"/>
-      <w:r>
-        <w:rPr>
-          <w:rFonts w:ascii="Times New Roman" w:eastAsia="Times New Roman" w:hAnsi="Times New Roman" w:cs="Times New Roman"/>
-          <w:sz w:val="24"/>
-          <w:szCs w:val="24"/>
-          <w:lang w:eastAsia="en-IN"/>
-        </w:rPr>
-        <w:t>ArrayList</w:t>
-      </w:r>
-      <w:proofErr w:type="spellEnd"/>
-      <w:r>
-        <w:rPr>
-          <w:rFonts w:ascii="Times New Roman" w:eastAsia="Times New Roman" w:hAnsi="Times New Roman" w:cs="Times New Roman"/>
-          <w:sz w:val="24"/>
-          <w:szCs w:val="24"/>
-          <w:lang w:eastAsia="en-IN"/>
-        </w:rPr>
-        <w:t xml:space="preserve"> or Vector. Every new element creates a new node and connects it using references, so there is no capacity or </w:t>
-      </w:r>
-      <w:proofErr w:type="gramStart"/>
-      <w:r>
-        <w:rPr>
-          <w:rFonts w:ascii="Times New Roman" w:eastAsia="Times New Roman" w:hAnsi="Times New Roman" w:cs="Times New Roman"/>
-          <w:sz w:val="24"/>
-          <w:szCs w:val="24"/>
-          <w:lang w:eastAsia="en-IN"/>
-        </w:rPr>
-        <w:t>resize</w:t>
-      </w:r>
-      <w:proofErr w:type="gramEnd"/>
-      <w:r>
-        <w:rPr>
-          <w:rFonts w:ascii="Times New Roman" w:eastAsia="Times New Roman" w:hAnsi="Times New Roman" w:cs="Times New Roman"/>
-          <w:sz w:val="24"/>
-          <w:szCs w:val="24"/>
-          <w:lang w:eastAsia="en-IN"/>
-        </w:rPr>
-        <w:t xml:space="preserve"> formula.</w:t>
-      </w:r>
-    </w:p>
-    <w:p>
-      <w:pPr>
-        <w:pStyle w:val="NormalWeb"/>
-      </w:pPr>
-    </w:p>
-    <w:p>
-      <w:pPr>
-        <w:shd w:val="clear" w:color="auto" w:fill="DDD9C3" w:themeFill="background2" w:themeFillShade="E6"/>
-      </w:pPr>
-      <w:r>
-        <w:rPr>
-          <w:rStyle w:val="g"/>
-        </w:rPr>
-        <w:t>import</w:t>
-      </w:r>
-      <w:r>
-        <w:t xml:space="preserve"> </w:t>
-      </w:r>
-      <w:proofErr w:type="spellStart"/>
-      <w:r>
-        <w:rPr>
-          <w:rStyle w:val="m"/>
-        </w:rPr>
-        <w:t>java</w:t>
-      </w:r>
-      <w:r>
-        <w:rPr>
-          <w:rStyle w:val="g"/>
-        </w:rPr>
-        <w:t>.</w:t>
-      </w:r>
-      <w:r>
-        <w:rPr>
-          <w:rStyle w:val="m"/>
-        </w:rPr>
-        <w:t>util</w:t>
-      </w:r>
-      <w:r>
-        <w:rPr>
-          <w:rStyle w:val="g"/>
-        </w:rPr>
-        <w:t>.</w:t>
-      </w:r>
-      <w:r>
-        <w:rPr>
-          <w:rStyle w:val="m"/>
-        </w:rPr>
-        <w:t>LinkedList</w:t>
-      </w:r>
-      <w:proofErr w:type="spellEnd"/>
-      <w:r>
-        <w:t>;</w:t>
-      </w:r>
-      <w:r>
-        <w:br/>
-      </w:r>
-      <w:r>
-        <w:br/>
-      </w:r>
-      <w:r>
-        <w:rPr>
-          <w:rStyle w:val="g"/>
-        </w:rPr>
-        <w:t>public</w:t>
-      </w:r>
-      <w:r>
-        <w:t xml:space="preserve"> </w:t>
-      </w:r>
-      <w:r>
-        <w:rPr>
-          <w:rStyle w:val="g"/>
-        </w:rPr>
-        <w:t>class</w:t>
-      </w:r>
-      <w:r>
-        <w:t xml:space="preserve"> </w:t>
-      </w:r>
-      <w:r>
-        <w:rPr>
-          <w:rStyle w:val="m"/>
-        </w:rPr>
-        <w:t>Main</w:t>
-      </w:r>
-      <w:r>
-        <w:t xml:space="preserve"> {</w:t>
-      </w:r>
-      <w:r>
-        <w:br/>
-      </w:r>
-      <w:r>
-        <w:rPr>
-          <w:rStyle w:val="g"/>
-        </w:rPr>
-        <w:t>public</w:t>
-      </w:r>
-      <w:r>
-        <w:t xml:space="preserve"> </w:t>
-      </w:r>
-      <w:r>
-        <w:rPr>
-          <w:rStyle w:val="g"/>
-        </w:rPr>
-        <w:t>static</w:t>
-      </w:r>
-      <w:r>
-        <w:t xml:space="preserve"> </w:t>
-      </w:r>
-      <w:r>
-        <w:rPr>
-          <w:rStyle w:val="g"/>
-        </w:rPr>
-        <w:t>void</w:t>
-      </w:r>
-      <w:r>
-        <w:t xml:space="preserve"> </w:t>
-      </w:r>
-      <w:r>
-        <w:rPr>
-          <w:rStyle w:val="m"/>
-        </w:rPr>
-        <w:t>main</w:t>
-      </w:r>
-      <w:r>
-        <w:t>(</w:t>
-      </w:r>
-      <w:r>
-        <w:rPr>
-          <w:rStyle w:val="m"/>
-        </w:rPr>
-        <w:t>String</w:t>
-      </w:r>
-      <w:r>
-        <w:t xml:space="preserve">[] </w:t>
-      </w:r>
-      <w:r>
-        <w:rPr>
-          <w:rStyle w:val="m"/>
-        </w:rPr>
-        <w:t>args</w:t>
-      </w:r>
-      <w:r>
-        <w:t>) {</w:t>
-      </w:r>
-      <w:r>
-        <w:br/>
-      </w:r>
-      <w:proofErr w:type="spellStart"/>
-      <w:r>
-        <w:rPr>
-          <w:rStyle w:val="m"/>
-        </w:rPr>
-        <w:t>LinkedList</w:t>
-      </w:r>
-      <w:proofErr w:type="spellEnd"/>
-      <w:r>
-        <w:t>&lt;</w:t>
-      </w:r>
-      <w:r>
-        <w:rPr>
-          <w:rStyle w:val="m"/>
-        </w:rPr>
-        <w:t>String</w:t>
-      </w:r>
-      <w:r>
-        <w:t xml:space="preserve">&gt; </w:t>
-      </w:r>
-      <w:r>
-        <w:rPr>
-          <w:rStyle w:val="m"/>
-        </w:rPr>
-        <w:t>list</w:t>
-      </w:r>
-      <w:r>
-        <w:t xml:space="preserve"> </w:t>
-      </w:r>
-      <w:r>
-        <w:rPr>
-          <w:rStyle w:val="g"/>
-        </w:rPr>
-        <w:t>=</w:t>
-      </w:r>
-      <w:r>
-        <w:t xml:space="preserve"> </w:t>
-      </w:r>
-      <w:r>
-        <w:rPr>
-          <w:rStyle w:val="g"/>
-        </w:rPr>
-        <w:t>new</w:t>
-      </w:r>
-      <w:r>
-        <w:t xml:space="preserve"> </w:t>
-      </w:r>
-      <w:proofErr w:type="spellStart"/>
-      <w:r>
-        <w:rPr>
-          <w:rStyle w:val="m"/>
-        </w:rPr>
-        <w:t>LinkedList</w:t>
-      </w:r>
-      <w:proofErr w:type="spellEnd"/>
-      <w:r>
-        <w:t>&lt;&gt;();</w:t>
-      </w:r>
-      <w:r>
-        <w:br/>
-      </w:r>
-      <w:r>
-        <w:br/>
-      </w:r>
-      <w:proofErr w:type="spellStart"/>
-      <w:r>
-        <w:rPr>
-          <w:rStyle w:val="m"/>
-        </w:rPr>
-        <w:t>list</w:t>
-      </w:r>
-      <w:r>
-        <w:rPr>
-          <w:rStyle w:val="g"/>
-        </w:rPr>
-        <w:t>.</w:t>
-      </w:r>
-      <w:r>
-        <w:rPr>
-          <w:rStyle w:val="m"/>
-        </w:rPr>
-        <w:t>add</w:t>
-      </w:r>
-      <w:proofErr w:type="spellEnd"/>
-      <w:r>
-        <w:t>(</w:t>
-      </w:r>
-      <w:r>
-        <w:rPr>
-          <w:rStyle w:val="k"/>
-        </w:rPr>
-        <w:t>"A"</w:t>
-      </w:r>
-      <w:r>
-        <w:t xml:space="preserve">); </w:t>
-      </w:r>
-      <w:r>
-        <w:rPr>
-          <w:rStyle w:val="e"/>
-        </w:rPr>
-        <w:t>// O(1) at end*</w:t>
-      </w:r>
-      <w:r>
-        <w:br/>
-      </w:r>
-      <w:proofErr w:type="spellStart"/>
-      <w:r>
-        <w:rPr>
-          <w:rStyle w:val="m"/>
-        </w:rPr>
-        <w:t>list</w:t>
-      </w:r>
-      <w:r>
-        <w:rPr>
-          <w:rStyle w:val="g"/>
-        </w:rPr>
-        <w:t>.</w:t>
-      </w:r>
-      <w:r>
-        <w:rPr>
-          <w:rStyle w:val="m"/>
-        </w:rPr>
-        <w:t>add</w:t>
-      </w:r>
-      <w:proofErr w:type="spellEnd"/>
-      <w:r>
-        <w:t>(</w:t>
-      </w:r>
-      <w:r>
-        <w:rPr>
-          <w:rStyle w:val="k"/>
-        </w:rPr>
-        <w:t>"B"</w:t>
-      </w:r>
-      <w:r>
-        <w:t xml:space="preserve">); </w:t>
-      </w:r>
-      <w:r>
-        <w:rPr>
-          <w:rStyle w:val="e"/>
-        </w:rPr>
-        <w:t>// O(1) at end*</w:t>
-      </w:r>
-      <w:r>
-        <w:br/>
-      </w:r>
-      <w:r>
-        <w:br/>
-      </w:r>
-      <w:proofErr w:type="spellStart"/>
-      <w:r>
-        <w:rPr>
-          <w:rStyle w:val="m"/>
-        </w:rPr>
-        <w:t>list</w:t>
-      </w:r>
-      <w:r>
-        <w:rPr>
-          <w:rStyle w:val="g"/>
-        </w:rPr>
-        <w:t>.</w:t>
-      </w:r>
-      <w:r>
-        <w:rPr>
-          <w:rStyle w:val="m"/>
-        </w:rPr>
-        <w:t>addFirst</w:t>
-      </w:r>
-      <w:proofErr w:type="spellEnd"/>
-      <w:r>
-        <w:t>(</w:t>
-      </w:r>
-      <w:r>
-        <w:rPr>
-          <w:rStyle w:val="k"/>
-        </w:rPr>
-        <w:t>"Start"</w:t>
-      </w:r>
-      <w:r>
-        <w:t xml:space="preserve">); </w:t>
-      </w:r>
-      <w:r>
-        <w:rPr>
-          <w:rStyle w:val="e"/>
-        </w:rPr>
-        <w:t>// O(1)</w:t>
-      </w:r>
-      <w:r>
-        <w:br/>
-      </w:r>
-      <w:proofErr w:type="spellStart"/>
-      <w:r>
-        <w:rPr>
-          <w:rStyle w:val="m"/>
-        </w:rPr>
-        <w:t>list</w:t>
-      </w:r>
-      <w:r>
-        <w:rPr>
-          <w:rStyle w:val="g"/>
-        </w:rPr>
-        <w:t>.</w:t>
-      </w:r>
-      <w:r>
-        <w:rPr>
-          <w:rStyle w:val="m"/>
-        </w:rPr>
-        <w:t>addLast</w:t>
-      </w:r>
-      <w:proofErr w:type="spellEnd"/>
-      <w:r>
-        <w:t>(</w:t>
-      </w:r>
-      <w:r>
-        <w:rPr>
-          <w:rStyle w:val="k"/>
-        </w:rPr>
-        <w:t>"End"</w:t>
-      </w:r>
-      <w:r>
-        <w:t xml:space="preserve">); </w:t>
-      </w:r>
-      <w:r>
-        <w:rPr>
-          <w:rStyle w:val="e"/>
-        </w:rPr>
-        <w:t>// O(1)</w:t>
-      </w:r>
-      <w:r>
-        <w:br/>
-      </w:r>
-      <w:r>
-        <w:lastRenderedPageBreak/>
-        <w:br/>
-      </w:r>
-      <w:proofErr w:type="spellStart"/>
-      <w:r>
-        <w:rPr>
-          <w:rStyle w:val="m"/>
-        </w:rPr>
-        <w:t>list</w:t>
-      </w:r>
-      <w:r>
-        <w:rPr>
-          <w:rStyle w:val="g"/>
-        </w:rPr>
-        <w:t>.</w:t>
-      </w:r>
-      <w:r>
-        <w:rPr>
-          <w:rStyle w:val="m"/>
-        </w:rPr>
-        <w:t>get</w:t>
-      </w:r>
-      <w:proofErr w:type="spellEnd"/>
-      <w:r>
-        <w:t>(</w:t>
-      </w:r>
-      <w:r>
-        <w:rPr>
-          <w:rStyle w:val="j"/>
-        </w:rPr>
-        <w:t>1</w:t>
-      </w:r>
-      <w:r>
-        <w:t xml:space="preserve">); </w:t>
-      </w:r>
-      <w:r>
-        <w:rPr>
-          <w:rStyle w:val="e"/>
-        </w:rPr>
-        <w:t>// O(n)</w:t>
-      </w:r>
-      <w:r>
-        <w:br/>
-      </w:r>
-      <w:proofErr w:type="spellStart"/>
-      <w:r>
-        <w:rPr>
-          <w:rStyle w:val="m"/>
-        </w:rPr>
-        <w:t>list</w:t>
-      </w:r>
-      <w:r>
-        <w:rPr>
-          <w:rStyle w:val="g"/>
-        </w:rPr>
-        <w:t>.</w:t>
-      </w:r>
-      <w:r>
-        <w:rPr>
-          <w:rStyle w:val="m"/>
-        </w:rPr>
-        <w:t>set</w:t>
-      </w:r>
-      <w:proofErr w:type="spellEnd"/>
-      <w:r>
-        <w:t>(</w:t>
-      </w:r>
-      <w:r>
-        <w:rPr>
-          <w:rStyle w:val="j"/>
-        </w:rPr>
-        <w:t>1</w:t>
-      </w:r>
-      <w:r>
-        <w:t xml:space="preserve">, </w:t>
-      </w:r>
-      <w:r>
-        <w:rPr>
-          <w:rStyle w:val="k"/>
-        </w:rPr>
-        <w:t>"X"</w:t>
-      </w:r>
-      <w:r>
-        <w:t xml:space="preserve">); </w:t>
-      </w:r>
-      <w:r>
-        <w:rPr>
-          <w:rStyle w:val="e"/>
-        </w:rPr>
-        <w:t>// O(n)</w:t>
-      </w:r>
-      <w:r>
-        <w:br/>
-      </w:r>
-      <w:r>
-        <w:br/>
-      </w:r>
-      <w:proofErr w:type="spellStart"/>
-      <w:r>
-        <w:rPr>
-          <w:rStyle w:val="m"/>
-        </w:rPr>
-        <w:t>list</w:t>
-      </w:r>
-      <w:r>
-        <w:rPr>
-          <w:rStyle w:val="g"/>
-        </w:rPr>
-        <w:t>.</w:t>
-      </w:r>
-      <w:r>
-        <w:rPr>
-          <w:rStyle w:val="m"/>
-        </w:rPr>
-        <w:t>contains</w:t>
-      </w:r>
-      <w:proofErr w:type="spellEnd"/>
-      <w:r>
-        <w:t>(</w:t>
-      </w:r>
-      <w:r>
-        <w:rPr>
-          <w:rStyle w:val="k"/>
-        </w:rPr>
-        <w:t>"A"</w:t>
-      </w:r>
-      <w:r>
-        <w:t xml:space="preserve">); </w:t>
-      </w:r>
-      <w:r>
-        <w:rPr>
-          <w:rStyle w:val="e"/>
-        </w:rPr>
-        <w:t>// O(n)</w:t>
-      </w:r>
-      <w:r>
-        <w:br/>
-      </w:r>
-      <w:r>
-        <w:br/>
-      </w:r>
-      <w:proofErr w:type="spellStart"/>
-      <w:r>
-        <w:rPr>
-          <w:rStyle w:val="m"/>
-        </w:rPr>
-        <w:t>list</w:t>
-      </w:r>
-      <w:r>
-        <w:rPr>
-          <w:rStyle w:val="g"/>
-        </w:rPr>
-        <w:t>.</w:t>
-      </w:r>
-      <w:r>
-        <w:rPr>
-          <w:rStyle w:val="m"/>
-        </w:rPr>
-        <w:t>removeFirst</w:t>
-      </w:r>
-      <w:proofErr w:type="spellEnd"/>
-      <w:r>
-        <w:t xml:space="preserve">(); </w:t>
-      </w:r>
-      <w:r>
-        <w:rPr>
-          <w:rStyle w:val="e"/>
-        </w:rPr>
-        <w:t>// O(1)</w:t>
-      </w:r>
-      <w:r>
-        <w:br/>
-      </w:r>
-      <w:proofErr w:type="spellStart"/>
-      <w:r>
-        <w:rPr>
-          <w:rStyle w:val="m"/>
-        </w:rPr>
-        <w:t>list</w:t>
-      </w:r>
-      <w:r>
-        <w:rPr>
-          <w:rStyle w:val="g"/>
-        </w:rPr>
-        <w:t>.</w:t>
-      </w:r>
-      <w:r>
-        <w:rPr>
-          <w:rStyle w:val="m"/>
-        </w:rPr>
-        <w:t>removeLast</w:t>
-      </w:r>
-      <w:proofErr w:type="spellEnd"/>
-      <w:r>
-        <w:t xml:space="preserve">(); </w:t>
-      </w:r>
-      <w:r>
-        <w:rPr>
-          <w:rStyle w:val="e"/>
-        </w:rPr>
-        <w:t>// O(1)</w:t>
-      </w:r>
-      <w:r>
-        <w:br/>
-      </w:r>
-      <w:r>
-        <w:br/>
-      </w:r>
-      <w:proofErr w:type="spellStart"/>
-      <w:r>
-        <w:rPr>
-          <w:rStyle w:val="m"/>
-        </w:rPr>
-        <w:t>list</w:t>
-      </w:r>
-      <w:r>
-        <w:rPr>
-          <w:rStyle w:val="g"/>
-        </w:rPr>
-        <w:t>.</w:t>
-      </w:r>
-      <w:r>
-        <w:rPr>
-          <w:rStyle w:val="m"/>
-        </w:rPr>
-        <w:t>size</w:t>
-      </w:r>
-      <w:proofErr w:type="spellEnd"/>
-      <w:r>
-        <w:t xml:space="preserve">(); </w:t>
-      </w:r>
-      <w:r>
-        <w:rPr>
-          <w:rStyle w:val="e"/>
-        </w:rPr>
-        <w:t>// O(1)</w:t>
-      </w:r>
-      <w:r>
-        <w:br/>
-      </w:r>
-      <w:r>
-        <w:br/>
-      </w:r>
-      <w:r>
-        <w:rPr>
-          <w:rStyle w:val="g"/>
-        </w:rPr>
-        <w:t>for</w:t>
-      </w:r>
-      <w:r>
-        <w:t xml:space="preserve"> (</w:t>
-      </w:r>
-      <w:r>
-        <w:rPr>
-          <w:rStyle w:val="m"/>
-        </w:rPr>
-        <w:t>String</w:t>
-      </w:r>
-      <w:r>
-        <w:t xml:space="preserve"> </w:t>
-      </w:r>
-      <w:r>
-        <w:rPr>
-          <w:rStyle w:val="m"/>
-        </w:rPr>
-        <w:t>s</w:t>
-      </w:r>
-      <w:r>
-        <w:t xml:space="preserve"> : </w:t>
-      </w:r>
-      <w:r>
-        <w:rPr>
-          <w:rStyle w:val="m"/>
-        </w:rPr>
-        <w:t>list</w:t>
-      </w:r>
-      <w:r>
-        <w:t xml:space="preserve">) { </w:t>
-      </w:r>
-      <w:r>
-        <w:rPr>
-          <w:rStyle w:val="e"/>
-        </w:rPr>
-        <w:t>// O(n)</w:t>
-      </w:r>
-      <w:r>
-        <w:br/>
-      </w:r>
-      <w:r>
-        <w:rPr>
-          <w:rStyle w:val="m"/>
-        </w:rPr>
-        <w:t>System</w:t>
-      </w:r>
-      <w:r>
-        <w:rPr>
-          <w:rStyle w:val="g"/>
-        </w:rPr>
-        <w:t>.</w:t>
-      </w:r>
-      <w:r>
-        <w:rPr>
-          <w:rStyle w:val="m"/>
-        </w:rPr>
-        <w:t>out</w:t>
-      </w:r>
-      <w:r>
-        <w:rPr>
-          <w:rStyle w:val="g"/>
-        </w:rPr>
-        <w:t>.</w:t>
-      </w:r>
-      <w:r>
-        <w:rPr>
-          <w:rStyle w:val="m"/>
-        </w:rPr>
-        <w:t>println</w:t>
-      </w:r>
-      <w:r>
-        <w:t>(</w:t>
-      </w:r>
-      <w:r>
-        <w:rPr>
-          <w:rStyle w:val="m"/>
-        </w:rPr>
-        <w:t>s</w:t>
-      </w:r>
-      <w:r>
-        <w:t>);</w:t>
-      </w:r>
-      <w:r>
-        <w:br/>
-        <w:t>}</w:t>
-      </w:r>
-      <w:r>
-        <w:br/>
-        <w:t>}</w:t>
-      </w:r>
-      <w:r>
-        <w:br/>
-        <w:t>}</w:t>
-      </w:r>
-    </w:p>
-    <w:p/>
-    <w:p>
-      <w:pPr>
-        <w:spacing w:before="100" w:beforeAutospacing="1" w:after="100" w:afterAutospacing="1" w:line="240" w:lineRule="auto"/>
-        <w:outlineLvl w:val="0"/>
+        <w:t>2.</w:t>
+      </w:r>
+      <w:r>
         <w:rPr>
           <w:rFonts w:ascii="Times New Roman" w:eastAsia="Times New Roman" w:hAnsi="Times New Roman" w:cs="Times New Roman"/>
           <w:b/>
@@ -3903,7 +2373,1641 @@
           <w:highlight w:val="red"/>
           <w:lang w:eastAsia="en-IN"/>
         </w:rPr>
-      </w:pPr>
+        <w:t>2</w:t>
+      </w:r>
+      <w:r>
+        <w:rPr>
+          <w:rFonts w:ascii="Times New Roman" w:eastAsia="Times New Roman" w:hAnsi="Times New Roman" w:cs="Times New Roman"/>
+          <w:b/>
+          <w:bCs/>
+          <w:kern w:val="36"/>
+          <w:sz w:val="48"/>
+          <w:szCs w:val="48"/>
+          <w:highlight w:val="red"/>
+          <w:lang w:eastAsia="en-IN"/>
+        </w:rPr>
+        <w:t xml:space="preserve"> </w:t>
+      </w:r>
+      <w:proofErr w:type="spellStart"/>
+      <w:r>
+        <w:rPr>
+          <w:rFonts w:ascii="Times New Roman" w:eastAsia="Times New Roman" w:hAnsi="Times New Roman" w:cs="Times New Roman"/>
+          <w:b/>
+          <w:bCs/>
+          <w:kern w:val="36"/>
+          <w:sz w:val="48"/>
+          <w:szCs w:val="48"/>
+          <w:highlight w:val="red"/>
+          <w:lang w:eastAsia="en-IN"/>
+        </w:rPr>
+        <w:t>LinkedList</w:t>
+      </w:r>
+      <w:proofErr w:type="spellEnd"/>
+    </w:p>
+    <w:p>
+      <w:pPr>
+        <w:pStyle w:val="Heading3"/>
+      </w:pPr>
+      <w:r>
+        <w:t>Definition</w:t>
+      </w:r>
+    </w:p>
+    <w:p>
+      <w:pPr>
+        <w:pStyle w:val="NormalWeb"/>
+      </w:pPr>
+      <w:proofErr w:type="spellStart"/>
+      <w:r>
+        <w:t>LinkedList</w:t>
+      </w:r>
+      <w:proofErr w:type="spellEnd"/>
+      <w:r>
+        <w:t xml:space="preserve"> is a class that implements the List interface using a doubly linked list.</w:t>
+      </w:r>
+    </w:p>
+    <w:p>
+      <w:pPr>
+        <w:pStyle w:val="Heading3"/>
+      </w:pPr>
+      <w:r>
+        <w:t>Follows List Rules</w:t>
+      </w:r>
+    </w:p>
+    <w:p>
+      <w:pPr>
+        <w:pStyle w:val="HTMLPreformatted"/>
+      </w:pPr>
+      <w:r>
+        <w:rPr>
+          <w:rStyle w:val="HTMLCode"/>
+        </w:rPr>
+        <w:t>Order      ✅</w:t>
+      </w:r>
+      <w:r>
+        <w:br/>
+      </w:r>
+      <w:proofErr w:type="gramStart"/>
+      <w:r>
+        <w:rPr>
+          <w:rStyle w:val="HTMLCode"/>
+        </w:rPr>
+        <w:t>Duplicate  ✅</w:t>
+      </w:r>
+      <w:proofErr w:type="gramEnd"/>
+      <w:r>
+        <w:rPr>
+          <w:rStyle w:val="HTMLCode"/>
+        </w:rPr>
+        <w:t xml:space="preserve"> Unlimited</w:t>
+      </w:r>
+      <w:r>
+        <w:br/>
+      </w:r>
+      <w:r>
+        <w:rPr>
+          <w:rStyle w:val="HTMLCode"/>
+        </w:rPr>
+        <w:t>Null       ✅ Unlimited</w:t>
+      </w:r>
+      <w:r>
+        <w:br/>
+      </w:r>
+      <w:r>
+        <w:rPr>
+          <w:rStyle w:val="HTMLCode"/>
+        </w:rPr>
+        <w:t>Index      ✅</w:t>
+      </w:r>
+    </w:p>
+    <w:p>
+      <w:pPr>
+        <w:pStyle w:val="Heading3"/>
+      </w:pPr>
+      <w:r>
+        <w:lastRenderedPageBreak/>
+        <w:t>Internal Working</w:t>
+      </w:r>
+    </w:p>
+    <w:p>
+      <w:pPr>
+        <w:pStyle w:val="HTMLPreformatted"/>
+      </w:pPr>
+      <w:r>
+        <w:rPr>
+          <w:rStyle w:val="HTMLCode"/>
+        </w:rPr>
+        <w:t>Head</w:t>
+      </w:r>
+      <w:r>
+        <w:br/>
+      </w:r>
+      <w:r>
+        <w:rPr>
+          <w:rStyle w:val="HTMLCode"/>
+        </w:rPr>
+        <w:t xml:space="preserve"> </w:t>
+      </w:r>
+      <w:proofErr w:type="gramStart"/>
+      <w:r>
+        <w:rPr>
+          <w:rStyle w:val="HTMLCode"/>
+        </w:rPr>
+        <w:t>↓</w:t>
+      </w:r>
+      <w:proofErr w:type="gramEnd"/>
+      <w:r>
+        <w:br/>
+      </w:r>
+      <w:r>
+        <w:rPr>
+          <w:rStyle w:val="HTMLCode"/>
+        </w:rPr>
+        <w:t xml:space="preserve">[Rahul] </w:t>
+      </w:r>
+      <w:r>
+        <w:rPr>
+          <w:rStyle w:val="HTMLCode"/>
+          <w:rFonts w:ascii="Cambria Math" w:hAnsi="Cambria Math" w:cs="Cambria Math"/>
+        </w:rPr>
+        <w:t>⇄</w:t>
+      </w:r>
+      <w:r>
+        <w:rPr>
+          <w:rStyle w:val="HTMLCode"/>
+        </w:rPr>
+        <w:t xml:space="preserve"> [Amit] </w:t>
+      </w:r>
+      <w:r>
+        <w:rPr>
+          <w:rStyle w:val="HTMLCode"/>
+          <w:rFonts w:ascii="Cambria Math" w:hAnsi="Cambria Math" w:cs="Cambria Math"/>
+        </w:rPr>
+        <w:t>⇄</w:t>
+      </w:r>
+      <w:r>
+        <w:rPr>
+          <w:rStyle w:val="HTMLCode"/>
+        </w:rPr>
+        <w:t xml:space="preserve"> [</w:t>
+      </w:r>
+      <w:proofErr w:type="spellStart"/>
+      <w:r>
+        <w:rPr>
+          <w:rStyle w:val="HTMLCode"/>
+        </w:rPr>
+        <w:t>Neha</w:t>
+      </w:r>
+      <w:proofErr w:type="spellEnd"/>
+      <w:r>
+        <w:rPr>
+          <w:rStyle w:val="HTMLCode"/>
+        </w:rPr>
+        <w:t xml:space="preserve">] </w:t>
+      </w:r>
+      <w:r>
+        <w:rPr>
+          <w:rStyle w:val="HTMLCode"/>
+          <w:rFonts w:ascii="Cambria Math" w:hAnsi="Cambria Math" w:cs="Cambria Math"/>
+        </w:rPr>
+        <w:t>⇄</w:t>
+      </w:r>
+      <w:r>
+        <w:rPr>
+          <w:rStyle w:val="HTMLCode"/>
+        </w:rPr>
+        <w:t xml:space="preserve"> [null]</w:t>
+      </w:r>
+      <w:r>
+        <w:br/>
+      </w:r>
+      <w:r>
+        <w:rPr>
+          <w:rStyle w:val="HTMLCode"/>
+        </w:rPr>
+        <w:t xml:space="preserve">                                ↑</w:t>
+      </w:r>
+      <w:r>
+        <w:br/>
+      </w:r>
+      <w:r>
+        <w:rPr>
+          <w:rStyle w:val="HTMLCode"/>
+        </w:rPr>
+        <w:t xml:space="preserve">                              Tail</w:t>
+      </w:r>
+    </w:p>
+    <w:p>
+      <w:pPr>
+        <w:pStyle w:val="NormalWeb"/>
+      </w:pPr>
+      <w:r>
+        <w:t>Each node contains:</w:t>
+      </w:r>
+    </w:p>
+    <w:p>
+      <w:pPr>
+        <w:pStyle w:val="HTMLPreformatted"/>
+      </w:pPr>
+      <w:r>
+        <w:rPr>
+          <w:rStyle w:val="HTMLCode"/>
+        </w:rPr>
+        <w:t>Data</w:t>
+      </w:r>
+      <w:r>
+        <w:br/>
+      </w:r>
+      <w:r>
+        <w:rPr>
+          <w:rStyle w:val="HTMLCode"/>
+        </w:rPr>
+        <w:t>Previous Reference</w:t>
+      </w:r>
+      <w:r>
+        <w:br/>
+      </w:r>
+      <w:r>
+        <w:rPr>
+          <w:rStyle w:val="HTMLCode"/>
+        </w:rPr>
+        <w:t>Next Reference</w:t>
+      </w:r>
+    </w:p>
+    <w:p>
+      <w:pPr>
+        <w:pStyle w:val="NormalWeb"/>
+      </w:pPr>
+      <w:r>
+        <w:t>Example:</w:t>
+      </w:r>
+    </w:p>
+    <w:p>
+      <w:pPr>
+        <w:pStyle w:val="HTMLPreformatted"/>
+      </w:pPr>
+      <w:r>
+        <w:rPr>
+          <w:rStyle w:val="HTMLCode"/>
+        </w:rPr>
+        <w:t>[Amit Node]</w:t>
+      </w:r>
+      <w:r>
+        <w:br/>
+      </w:r>
+      <w:r>
+        <w:br/>
+      </w:r>
+      <w:r>
+        <w:rPr>
+          <w:rStyle w:val="HTMLCode"/>
+        </w:rPr>
+        <w:t>Data = Amit</w:t>
+      </w:r>
+      <w:r>
+        <w:br/>
+      </w:r>
+      <w:proofErr w:type="spellStart"/>
+      <w:r>
+        <w:rPr>
+          <w:rStyle w:val="HTMLCode"/>
+        </w:rPr>
+        <w:t>Prev</w:t>
+      </w:r>
+      <w:proofErr w:type="spellEnd"/>
+      <w:r>
+        <w:rPr>
+          <w:rStyle w:val="HTMLCode"/>
+        </w:rPr>
+        <w:t xml:space="preserve"> = Rahul</w:t>
+      </w:r>
+      <w:r>
+        <w:br/>
+      </w:r>
+      <w:r>
+        <w:rPr>
+          <w:rStyle w:val="HTMLCode"/>
+        </w:rPr>
+        <w:t xml:space="preserve">Next = </w:t>
+      </w:r>
+      <w:proofErr w:type="spellStart"/>
+      <w:r>
+        <w:rPr>
+          <w:rStyle w:val="HTMLCode"/>
+        </w:rPr>
+        <w:t>Neha</w:t>
+      </w:r>
+      <w:proofErr w:type="spellEnd"/>
+    </w:p>
+    <w:p>
+      <w:pPr>
+        <w:pStyle w:val="Heading3"/>
+      </w:pPr>
+      <w:r>
+        <w:t xml:space="preserve">How </w:t>
+      </w:r>
+      <w:proofErr w:type="gramStart"/>
+      <w:r>
+        <w:t>get(</w:t>
+      </w:r>
+      <w:proofErr w:type="gramEnd"/>
+      <w:r>
+        <w:t>2) Works?</w:t>
+      </w:r>
+    </w:p>
+    <w:p>
+      <w:pPr>
+        <w:pStyle w:val="HTMLPreformatted"/>
+      </w:pPr>
+      <w:proofErr w:type="spellStart"/>
+      <w:proofErr w:type="gramStart"/>
+      <w:r>
+        <w:rPr>
+          <w:rStyle w:val="m"/>
+        </w:rPr>
+        <w:t>list</w:t>
+      </w:r>
+      <w:r>
+        <w:rPr>
+          <w:rStyle w:val="g"/>
+        </w:rPr>
+        <w:t>.</w:t>
+      </w:r>
+      <w:r>
+        <w:rPr>
+          <w:rStyle w:val="m"/>
+        </w:rPr>
+        <w:t>get</w:t>
+      </w:r>
+      <w:proofErr w:type="spellEnd"/>
+      <w:r>
+        <w:rPr>
+          <w:rStyle w:val="HTMLCode"/>
+        </w:rPr>
+        <w:t>(</w:t>
+      </w:r>
+      <w:proofErr w:type="gramEnd"/>
+      <w:r>
+        <w:rPr>
+          <w:rStyle w:val="j"/>
+        </w:rPr>
+        <w:t>2</w:t>
+      </w:r>
+      <w:r>
+        <w:rPr>
+          <w:rStyle w:val="HTMLCode"/>
+        </w:rPr>
+        <w:t>);</w:t>
+      </w:r>
+    </w:p>
+    <w:p>
+      <w:pPr>
+        <w:pStyle w:val="NormalWeb"/>
+      </w:pPr>
+      <w:r>
+        <w:lastRenderedPageBreak/>
+        <w:t>Internally:</w:t>
+      </w:r>
+    </w:p>
+    <w:p>
+      <w:pPr>
+        <w:pStyle w:val="HTMLPreformatted"/>
+      </w:pPr>
+      <w:r>
+        <w:rPr>
+          <w:rStyle w:val="HTMLCode"/>
+        </w:rPr>
+        <w:t xml:space="preserve">Rahul → Amit → </w:t>
+      </w:r>
+      <w:proofErr w:type="spellStart"/>
+      <w:r>
+        <w:rPr>
+          <w:rStyle w:val="HTMLCode"/>
+        </w:rPr>
+        <w:t>Neha</w:t>
+      </w:r>
+      <w:proofErr w:type="spellEnd"/>
+    </w:p>
+    <w:p>
+      <w:pPr>
+        <w:pStyle w:val="NormalWeb"/>
+      </w:pPr>
+      <w:proofErr w:type="gramStart"/>
+      <w:r>
+        <w:t>Traverses node by node until index 2.</w:t>
+      </w:r>
+      <w:proofErr w:type="gramEnd"/>
+    </w:p>
+    <w:p>
+      <w:r>
+        <w:pict>
+          <v:rect id="_x0000_i1026" style="width:0;height:1.5pt" o:hralign="center" o:hrstd="t" o:hr="t" fillcolor="#a0a0a0" stroked="f"/>
+        </w:pict>
+      </w:r>
+    </w:p>
+    <w:p>
+      <w:pPr>
+        <w:pStyle w:val="Heading3"/>
+      </w:pPr>
+      <w:r>
+        <w:t>How Insert Works?</w:t>
+      </w:r>
+    </w:p>
+    <w:p>
+      <w:pPr>
+        <w:pStyle w:val="NormalWeb"/>
+      </w:pPr>
+      <w:r>
+        <w:t>Before:</w:t>
+      </w:r>
+    </w:p>
+    <w:p>
+      <w:pPr>
+        <w:pStyle w:val="HTMLPreformatted"/>
+      </w:pPr>
+      <w:r>
+        <w:rPr>
+          <w:rStyle w:val="HTMLCode"/>
+        </w:rPr>
+        <w:t xml:space="preserve">A </w:t>
+      </w:r>
+      <w:r>
+        <w:rPr>
+          <w:rStyle w:val="HTMLCode"/>
+          <w:rFonts w:ascii="Cambria Math" w:hAnsi="Cambria Math" w:cs="Cambria Math"/>
+        </w:rPr>
+        <w:t>⇄</w:t>
+      </w:r>
+      <w:r>
+        <w:rPr>
+          <w:rStyle w:val="HTMLCode"/>
+        </w:rPr>
+        <w:t xml:space="preserve"> B </w:t>
+      </w:r>
+      <w:r>
+        <w:rPr>
+          <w:rStyle w:val="HTMLCode"/>
+          <w:rFonts w:ascii="Cambria Math" w:hAnsi="Cambria Math" w:cs="Cambria Math"/>
+        </w:rPr>
+        <w:t>⇄</w:t>
+      </w:r>
+      <w:r>
+        <w:rPr>
+          <w:rStyle w:val="HTMLCode"/>
+        </w:rPr>
+        <w:t xml:space="preserve"> C</w:t>
+      </w:r>
+    </w:p>
+    <w:p>
+      <w:pPr>
+        <w:pStyle w:val="NormalWeb"/>
+      </w:pPr>
+      <w:r>
+        <w:t>Insert X:</w:t>
+      </w:r>
+    </w:p>
+    <w:p>
+      <w:pPr>
+        <w:pStyle w:val="HTMLPreformatted"/>
+      </w:pPr>
+      <w:r>
+        <w:rPr>
+          <w:rStyle w:val="HTMLCode"/>
+        </w:rPr>
+        <w:t xml:space="preserve">A </w:t>
+      </w:r>
+      <w:r>
+        <w:rPr>
+          <w:rStyle w:val="HTMLCode"/>
+          <w:rFonts w:ascii="Cambria Math" w:hAnsi="Cambria Math" w:cs="Cambria Math"/>
+        </w:rPr>
+        <w:t>⇄</w:t>
+      </w:r>
+      <w:r>
+        <w:rPr>
+          <w:rStyle w:val="HTMLCode"/>
+        </w:rPr>
+        <w:t xml:space="preserve"> X </w:t>
+      </w:r>
+      <w:r>
+        <w:rPr>
+          <w:rStyle w:val="HTMLCode"/>
+          <w:rFonts w:ascii="Cambria Math" w:hAnsi="Cambria Math" w:cs="Cambria Math"/>
+        </w:rPr>
+        <w:t>⇄</w:t>
+      </w:r>
+      <w:r>
+        <w:rPr>
+          <w:rStyle w:val="HTMLCode"/>
+        </w:rPr>
+        <w:t xml:space="preserve"> B </w:t>
+      </w:r>
+      <w:r>
+        <w:rPr>
+          <w:rStyle w:val="HTMLCode"/>
+          <w:rFonts w:ascii="Cambria Math" w:hAnsi="Cambria Math" w:cs="Cambria Math"/>
+        </w:rPr>
+        <w:t>⇄</w:t>
+      </w:r>
+      <w:r>
+        <w:rPr>
+          <w:rStyle w:val="HTMLCode"/>
+        </w:rPr>
+        <w:t xml:space="preserve"> C</w:t>
+      </w:r>
+    </w:p>
+    <w:p>
+      <w:pPr>
+        <w:pStyle w:val="NormalWeb"/>
+      </w:pPr>
+      <w:r>
+        <w:t>No shifting.</w:t>
+      </w:r>
+    </w:p>
+    <w:p>
+      <w:pPr>
+        <w:pStyle w:val="NormalWeb"/>
+      </w:pPr>
+      <w:r>
+        <w:t>Only references are updated.</w:t>
+      </w:r>
+    </w:p>
+    <w:p>
+      <w:r>
+        <w:pict>
+          <v:rect id="_x0000_i1027" style="width:0;height:1.5pt" o:hralign="center" o:hrstd="t" o:hr="t" fillcolor="#a0a0a0" stroked="f"/>
+        </w:pict>
+      </w:r>
+    </w:p>
+    <w:p>
+      <w:pPr>
+        <w:pStyle w:val="Heading3"/>
+      </w:pPr>
+      <w:r>
+        <w:lastRenderedPageBreak/>
+        <w:t>How Delete Works?</w:t>
+      </w:r>
+    </w:p>
+    <w:p>
+      <w:pPr>
+        <w:pStyle w:val="NormalWeb"/>
+      </w:pPr>
+      <w:r>
+        <w:t>Before:</w:t>
+      </w:r>
+    </w:p>
+    <w:p>
+      <w:pPr>
+        <w:pStyle w:val="HTMLPreformatted"/>
+      </w:pPr>
+      <w:r>
+        <w:rPr>
+          <w:rStyle w:val="HTMLCode"/>
+        </w:rPr>
+        <w:t xml:space="preserve">A </w:t>
+      </w:r>
+      <w:r>
+        <w:rPr>
+          <w:rStyle w:val="HTMLCode"/>
+          <w:rFonts w:ascii="Cambria Math" w:hAnsi="Cambria Math" w:cs="Cambria Math"/>
+        </w:rPr>
+        <w:t>⇄</w:t>
+      </w:r>
+      <w:r>
+        <w:rPr>
+          <w:rStyle w:val="HTMLCode"/>
+        </w:rPr>
+        <w:t xml:space="preserve"> B </w:t>
+      </w:r>
+      <w:r>
+        <w:rPr>
+          <w:rStyle w:val="HTMLCode"/>
+          <w:rFonts w:ascii="Cambria Math" w:hAnsi="Cambria Math" w:cs="Cambria Math"/>
+        </w:rPr>
+        <w:t>⇄</w:t>
+      </w:r>
+      <w:r>
+        <w:rPr>
+          <w:rStyle w:val="HTMLCode"/>
+        </w:rPr>
+        <w:t xml:space="preserve"> C</w:t>
+      </w:r>
+    </w:p>
+    <w:p>
+      <w:pPr>
+        <w:pStyle w:val="NormalWeb"/>
+      </w:pPr>
+      <w:r>
+        <w:t>Remove B:</w:t>
+      </w:r>
+    </w:p>
+    <w:p>
+      <w:pPr>
+        <w:pStyle w:val="HTMLPreformatted"/>
+      </w:pPr>
+      <w:r>
+        <w:rPr>
+          <w:rStyle w:val="HTMLCode"/>
+        </w:rPr>
+        <w:t xml:space="preserve">A </w:t>
+      </w:r>
+      <w:r>
+        <w:rPr>
+          <w:rStyle w:val="HTMLCode"/>
+          <w:rFonts w:ascii="Cambria Math" w:hAnsi="Cambria Math" w:cs="Cambria Math"/>
+        </w:rPr>
+        <w:t>⇄</w:t>
+      </w:r>
+      <w:r>
+        <w:rPr>
+          <w:rStyle w:val="HTMLCode"/>
+        </w:rPr>
+        <w:t xml:space="preserve"> C</w:t>
+      </w:r>
+    </w:p>
+    <w:p>
+      <w:pPr>
+        <w:pStyle w:val="NormalWeb"/>
+      </w:pPr>
+      <w:r>
+        <w:t>Again, only references are updated.</w:t>
+      </w:r>
+    </w:p>
+    <w:p>
+      <w:r>
+        <w:pict>
+          <v:rect id="_x0000_i1028" style="width:0;height:1.5pt" o:hralign="center" o:hrstd="t" o:hr="t" fillcolor="#a0a0a0" stroked="f"/>
+        </w:pict>
+      </w:r>
+    </w:p>
+    <w:p>
+      <w:pPr>
+        <w:pStyle w:val="Heading3"/>
+      </w:pPr>
+      <w:r>
+        <w:t>Performance</w:t>
+      </w:r>
+    </w:p>
+    <w:p>
+      <w:pPr>
+        <w:pStyle w:val="HTMLPreformatted"/>
+      </w:pPr>
+      <w:proofErr w:type="gramStart"/>
+      <w:r>
+        <w:rPr>
+          <w:rStyle w:val="HTMLCode"/>
+        </w:rPr>
+        <w:t>get(</w:t>
+      </w:r>
+      <w:proofErr w:type="gramEnd"/>
+      <w:r>
+        <w:rPr>
+          <w:rStyle w:val="HTMLCode"/>
+        </w:rPr>
+        <w:t>)      O(n)</w:t>
+      </w:r>
+      <w:r>
+        <w:br/>
+      </w:r>
+      <w:r>
+        <w:rPr>
+          <w:rStyle w:val="HTMLCode"/>
+        </w:rPr>
+        <w:t>add()      O(1)*</w:t>
+      </w:r>
+      <w:r>
+        <w:br/>
+      </w:r>
+      <w:r>
+        <w:rPr>
+          <w:rStyle w:val="HTMLCode"/>
+        </w:rPr>
+        <w:t>remove()   O(1)*</w:t>
+      </w:r>
+    </w:p>
+    <w:p>
+      <w:pPr>
+        <w:pStyle w:val="Heading3"/>
+      </w:pPr>
+      <w:r>
+        <w:t>Interview One-Liner</w:t>
+      </w:r>
+    </w:p>
+    <w:p>
+      <w:pPr>
+        <w:pStyle w:val="NormalWeb"/>
+        <w:rPr>
+          <w:rStyle w:val="Strong"/>
+        </w:rPr>
+      </w:pPr>
+      <w:proofErr w:type="spellStart"/>
+      <w:r>
+        <w:rPr>
+          <w:rStyle w:val="Strong"/>
+        </w:rPr>
+        <w:lastRenderedPageBreak/>
+        <w:t>LinkedList</w:t>
+      </w:r>
+      <w:proofErr w:type="spellEnd"/>
+      <w:r>
+        <w:rPr>
+          <w:rStyle w:val="Strong"/>
+        </w:rPr>
+        <w:t xml:space="preserve"> is a doubly linked list implementation of List that maintains insertion order, allows unlimited duplicates and null values, supports index-based access, stores data in nodes connected by previous and next references, and provides fast insertion and deletion without shifting elements.</w:t>
+      </w:r>
+    </w:p>
+    <w:p>
+      <w:pPr>
+        <w:spacing w:before="100" w:beforeAutospacing="1" w:after="100" w:afterAutospacing="1" w:line="240" w:lineRule="auto"/>
+        <w:rPr>
+          <w:rFonts w:ascii="Times New Roman" w:eastAsia="Times New Roman" w:hAnsi="Times New Roman" w:cs="Times New Roman"/>
+          <w:sz w:val="24"/>
+          <w:szCs w:val="24"/>
+          <w:lang w:eastAsia="en-IN"/>
+        </w:rPr>
+      </w:pPr>
+      <w:r>
+        <w:rPr>
+          <w:rFonts w:ascii="Times New Roman" w:eastAsia="Times New Roman" w:hAnsi="Times New Roman" w:cs="Times New Roman"/>
+          <w:b/>
+          <w:bCs/>
+          <w:sz w:val="24"/>
+          <w:szCs w:val="24"/>
+          <w:lang w:eastAsia="en-IN"/>
+        </w:rPr>
+        <w:t xml:space="preserve">How does </w:t>
+      </w:r>
+      <w:proofErr w:type="spellStart"/>
+      <w:r>
+        <w:rPr>
+          <w:rFonts w:ascii="Times New Roman" w:eastAsia="Times New Roman" w:hAnsi="Times New Roman" w:cs="Times New Roman"/>
+          <w:b/>
+          <w:bCs/>
+          <w:sz w:val="24"/>
+          <w:szCs w:val="24"/>
+          <w:lang w:eastAsia="en-IN"/>
+        </w:rPr>
+        <w:t>LinkedList</w:t>
+      </w:r>
+      <w:proofErr w:type="spellEnd"/>
+      <w:r>
+        <w:rPr>
+          <w:rFonts w:ascii="Times New Roman" w:eastAsia="Times New Roman" w:hAnsi="Times New Roman" w:cs="Times New Roman"/>
+          <w:b/>
+          <w:bCs/>
+          <w:sz w:val="24"/>
+          <w:szCs w:val="24"/>
+          <w:lang w:eastAsia="en-IN"/>
+        </w:rPr>
+        <w:t xml:space="preserve"> increase its size?</w:t>
+      </w:r>
+    </w:p>
+    <w:p>
+      <w:pPr>
+        <w:spacing w:beforeAutospacing="1" w:after="100" w:afterAutospacing="1" w:line="240" w:lineRule="auto"/>
+        <w:rPr>
+          <w:rFonts w:ascii="Times New Roman" w:eastAsia="Times New Roman" w:hAnsi="Times New Roman" w:cs="Times New Roman"/>
+          <w:sz w:val="24"/>
+          <w:szCs w:val="24"/>
+          <w:lang w:eastAsia="en-IN"/>
+        </w:rPr>
+      </w:pPr>
+      <w:proofErr w:type="spellStart"/>
+      <w:r>
+        <w:rPr>
+          <w:rFonts w:ascii="Times New Roman" w:eastAsia="Times New Roman" w:hAnsi="Times New Roman" w:cs="Times New Roman"/>
+          <w:sz w:val="24"/>
+          <w:szCs w:val="24"/>
+          <w:lang w:eastAsia="en-IN"/>
+        </w:rPr>
+        <w:t>LinkedList</w:t>
+      </w:r>
+      <w:proofErr w:type="spellEnd"/>
+      <w:r>
+        <w:rPr>
+          <w:rFonts w:ascii="Times New Roman" w:eastAsia="Times New Roman" w:hAnsi="Times New Roman" w:cs="Times New Roman"/>
+          <w:sz w:val="24"/>
+          <w:szCs w:val="24"/>
+          <w:lang w:eastAsia="en-IN"/>
+        </w:rPr>
+        <w:t xml:space="preserve"> does not resize like </w:t>
+      </w:r>
+      <w:proofErr w:type="spellStart"/>
+      <w:r>
+        <w:rPr>
+          <w:rFonts w:ascii="Times New Roman" w:eastAsia="Times New Roman" w:hAnsi="Times New Roman" w:cs="Times New Roman"/>
+          <w:sz w:val="24"/>
+          <w:szCs w:val="24"/>
+          <w:lang w:eastAsia="en-IN"/>
+        </w:rPr>
+        <w:t>ArrayList</w:t>
+      </w:r>
+      <w:proofErr w:type="spellEnd"/>
+      <w:r>
+        <w:rPr>
+          <w:rFonts w:ascii="Times New Roman" w:eastAsia="Times New Roman" w:hAnsi="Times New Roman" w:cs="Times New Roman"/>
+          <w:sz w:val="24"/>
+          <w:szCs w:val="24"/>
+          <w:lang w:eastAsia="en-IN"/>
+        </w:rPr>
+        <w:t xml:space="preserve"> or Vector. Every new element creates a new node and connects it using references, so there is no capacity or </w:t>
+      </w:r>
+      <w:proofErr w:type="gramStart"/>
+      <w:r>
+        <w:rPr>
+          <w:rFonts w:ascii="Times New Roman" w:eastAsia="Times New Roman" w:hAnsi="Times New Roman" w:cs="Times New Roman"/>
+          <w:sz w:val="24"/>
+          <w:szCs w:val="24"/>
+          <w:lang w:eastAsia="en-IN"/>
+        </w:rPr>
+        <w:t>resize</w:t>
+      </w:r>
+      <w:proofErr w:type="gramEnd"/>
+      <w:r>
+        <w:rPr>
+          <w:rFonts w:ascii="Times New Roman" w:eastAsia="Times New Roman" w:hAnsi="Times New Roman" w:cs="Times New Roman"/>
+          <w:sz w:val="24"/>
+          <w:szCs w:val="24"/>
+          <w:lang w:eastAsia="en-IN"/>
+        </w:rPr>
+        <w:t xml:space="preserve"> formula.</w:t>
+      </w:r>
+    </w:p>
+    <w:p>
+      <w:pPr>
+        <w:pStyle w:val="NormalWeb"/>
+      </w:pPr>
+    </w:p>
+    <w:p>
+      <w:pPr>
+        <w:shd w:val="clear" w:color="auto" w:fill="DDD9C3" w:themeFill="background2" w:themeFillShade="E6"/>
+      </w:pPr>
+      <w:r>
+        <w:rPr>
+          <w:rStyle w:val="g"/>
+        </w:rPr>
+        <w:t>import</w:t>
+      </w:r>
+      <w:r>
+        <w:t xml:space="preserve"> </w:t>
+      </w:r>
+      <w:proofErr w:type="spellStart"/>
+      <w:r>
+        <w:rPr>
+          <w:rStyle w:val="m"/>
+        </w:rPr>
+        <w:t>java</w:t>
+      </w:r>
+      <w:r>
+        <w:rPr>
+          <w:rStyle w:val="g"/>
+        </w:rPr>
+        <w:t>.</w:t>
+      </w:r>
+      <w:r>
+        <w:rPr>
+          <w:rStyle w:val="m"/>
+        </w:rPr>
+        <w:t>util</w:t>
+      </w:r>
+      <w:r>
+        <w:rPr>
+          <w:rStyle w:val="g"/>
+        </w:rPr>
+        <w:t>.</w:t>
+      </w:r>
+      <w:r>
+        <w:rPr>
+          <w:rStyle w:val="m"/>
+        </w:rPr>
+        <w:t>LinkedList</w:t>
+      </w:r>
+      <w:proofErr w:type="spellEnd"/>
+      <w:r>
+        <w:t>;</w:t>
+      </w:r>
+      <w:r>
+        <w:br/>
+      </w:r>
+      <w:r>
+        <w:br/>
+      </w:r>
+      <w:r>
+        <w:rPr>
+          <w:rStyle w:val="g"/>
+        </w:rPr>
+        <w:t>public</w:t>
+      </w:r>
+      <w:r>
+        <w:t xml:space="preserve"> </w:t>
+      </w:r>
+      <w:r>
+        <w:rPr>
+          <w:rStyle w:val="g"/>
+        </w:rPr>
+        <w:t>class</w:t>
+      </w:r>
+      <w:r>
+        <w:t xml:space="preserve"> </w:t>
+      </w:r>
+      <w:r>
+        <w:rPr>
+          <w:rStyle w:val="m"/>
+        </w:rPr>
+        <w:t>Main</w:t>
+      </w:r>
+      <w:r>
+        <w:t xml:space="preserve"> {</w:t>
+      </w:r>
+      <w:r>
+        <w:br/>
+      </w:r>
+      <w:r>
+        <w:rPr>
+          <w:rStyle w:val="g"/>
+        </w:rPr>
+        <w:t>public</w:t>
+      </w:r>
+      <w:r>
+        <w:t xml:space="preserve"> </w:t>
+      </w:r>
+      <w:r>
+        <w:rPr>
+          <w:rStyle w:val="g"/>
+        </w:rPr>
+        <w:t>static</w:t>
+      </w:r>
+      <w:r>
+        <w:t xml:space="preserve"> </w:t>
+      </w:r>
+      <w:r>
+        <w:rPr>
+          <w:rStyle w:val="g"/>
+        </w:rPr>
+        <w:t>void</w:t>
+      </w:r>
+      <w:r>
+        <w:t xml:space="preserve"> </w:t>
+      </w:r>
+      <w:r>
+        <w:rPr>
+          <w:rStyle w:val="m"/>
+        </w:rPr>
+        <w:t>main</w:t>
+      </w:r>
+      <w:r>
+        <w:t>(</w:t>
+      </w:r>
+      <w:r>
+        <w:rPr>
+          <w:rStyle w:val="m"/>
+        </w:rPr>
+        <w:t>String</w:t>
+      </w:r>
+      <w:r>
+        <w:t xml:space="preserve">[] </w:t>
+      </w:r>
+      <w:r>
+        <w:rPr>
+          <w:rStyle w:val="m"/>
+        </w:rPr>
+        <w:t>args</w:t>
+      </w:r>
+      <w:r>
+        <w:t>) {</w:t>
+      </w:r>
+      <w:r>
+        <w:br/>
+      </w:r>
+      <w:proofErr w:type="spellStart"/>
+      <w:r>
+        <w:rPr>
+          <w:rStyle w:val="m"/>
+        </w:rPr>
+        <w:t>LinkedList</w:t>
+      </w:r>
+      <w:proofErr w:type="spellEnd"/>
+      <w:r>
+        <w:t>&lt;</w:t>
+      </w:r>
+      <w:r>
+        <w:rPr>
+          <w:rStyle w:val="m"/>
+        </w:rPr>
+        <w:t>String</w:t>
+      </w:r>
+      <w:r>
+        <w:t xml:space="preserve">&gt; </w:t>
+      </w:r>
+      <w:r>
+        <w:rPr>
+          <w:rStyle w:val="m"/>
+        </w:rPr>
+        <w:t>list</w:t>
+      </w:r>
+      <w:r>
+        <w:t xml:space="preserve"> </w:t>
+      </w:r>
+      <w:r>
+        <w:rPr>
+          <w:rStyle w:val="g"/>
+        </w:rPr>
+        <w:t>=</w:t>
+      </w:r>
+      <w:r>
+        <w:t xml:space="preserve"> </w:t>
+      </w:r>
+      <w:r>
+        <w:rPr>
+          <w:rStyle w:val="g"/>
+        </w:rPr>
+        <w:t>new</w:t>
+      </w:r>
+      <w:r>
+        <w:t xml:space="preserve"> </w:t>
+      </w:r>
+      <w:proofErr w:type="spellStart"/>
+      <w:r>
+        <w:rPr>
+          <w:rStyle w:val="m"/>
+        </w:rPr>
+        <w:t>LinkedList</w:t>
+      </w:r>
+      <w:proofErr w:type="spellEnd"/>
+      <w:r>
+        <w:t>&lt;&gt;();</w:t>
+      </w:r>
+      <w:r>
+        <w:br/>
+      </w:r>
+      <w:r>
+        <w:br/>
+      </w:r>
+      <w:proofErr w:type="spellStart"/>
+      <w:r>
+        <w:rPr>
+          <w:rStyle w:val="m"/>
+        </w:rPr>
+        <w:t>list</w:t>
+      </w:r>
+      <w:r>
+        <w:rPr>
+          <w:rStyle w:val="g"/>
+        </w:rPr>
+        <w:t>.</w:t>
+      </w:r>
+      <w:r>
+        <w:rPr>
+          <w:rStyle w:val="m"/>
+        </w:rPr>
+        <w:t>add</w:t>
+      </w:r>
+      <w:proofErr w:type="spellEnd"/>
+      <w:r>
+        <w:t>(</w:t>
+      </w:r>
+      <w:r>
+        <w:rPr>
+          <w:rStyle w:val="k"/>
+        </w:rPr>
+        <w:t>"A"</w:t>
+      </w:r>
+      <w:r>
+        <w:t xml:space="preserve">); </w:t>
+      </w:r>
+      <w:r>
+        <w:rPr>
+          <w:rStyle w:val="e"/>
+        </w:rPr>
+        <w:t>// O(1) at end*</w:t>
+      </w:r>
+      <w:r>
+        <w:br/>
+      </w:r>
+      <w:proofErr w:type="spellStart"/>
+      <w:r>
+        <w:rPr>
+          <w:rStyle w:val="m"/>
+        </w:rPr>
+        <w:t>list</w:t>
+      </w:r>
+      <w:r>
+        <w:rPr>
+          <w:rStyle w:val="g"/>
+        </w:rPr>
+        <w:t>.</w:t>
+      </w:r>
+      <w:r>
+        <w:rPr>
+          <w:rStyle w:val="m"/>
+        </w:rPr>
+        <w:t>add</w:t>
+      </w:r>
+      <w:proofErr w:type="spellEnd"/>
+      <w:r>
+        <w:t>(</w:t>
+      </w:r>
+      <w:r>
+        <w:rPr>
+          <w:rStyle w:val="k"/>
+        </w:rPr>
+        <w:t>"B"</w:t>
+      </w:r>
+      <w:r>
+        <w:t xml:space="preserve">); </w:t>
+      </w:r>
+      <w:r>
+        <w:rPr>
+          <w:rStyle w:val="e"/>
+        </w:rPr>
+        <w:t>// O(1) at end*</w:t>
+      </w:r>
+      <w:r>
+        <w:br/>
+      </w:r>
+      <w:r>
+        <w:br/>
+      </w:r>
+      <w:proofErr w:type="spellStart"/>
+      <w:r>
+        <w:rPr>
+          <w:rStyle w:val="m"/>
+        </w:rPr>
+        <w:t>list</w:t>
+      </w:r>
+      <w:r>
+        <w:rPr>
+          <w:rStyle w:val="g"/>
+        </w:rPr>
+        <w:t>.</w:t>
+      </w:r>
+      <w:r>
+        <w:rPr>
+          <w:rStyle w:val="m"/>
+        </w:rPr>
+        <w:t>addFirst</w:t>
+      </w:r>
+      <w:proofErr w:type="spellEnd"/>
+      <w:r>
+        <w:t>(</w:t>
+      </w:r>
+      <w:r>
+        <w:rPr>
+          <w:rStyle w:val="k"/>
+        </w:rPr>
+        <w:t>"Start"</w:t>
+      </w:r>
+      <w:r>
+        <w:t xml:space="preserve">); </w:t>
+      </w:r>
+      <w:r>
+        <w:rPr>
+          <w:rStyle w:val="e"/>
+        </w:rPr>
+        <w:t>// O(1)</w:t>
+      </w:r>
+      <w:r>
+        <w:br/>
+      </w:r>
+      <w:proofErr w:type="spellStart"/>
+      <w:r>
+        <w:rPr>
+          <w:rStyle w:val="m"/>
+        </w:rPr>
+        <w:t>list</w:t>
+      </w:r>
+      <w:r>
+        <w:rPr>
+          <w:rStyle w:val="g"/>
+        </w:rPr>
+        <w:t>.</w:t>
+      </w:r>
+      <w:r>
+        <w:rPr>
+          <w:rStyle w:val="m"/>
+        </w:rPr>
+        <w:t>addLast</w:t>
+      </w:r>
+      <w:proofErr w:type="spellEnd"/>
+      <w:r>
+        <w:t>(</w:t>
+      </w:r>
+      <w:r>
+        <w:rPr>
+          <w:rStyle w:val="k"/>
+        </w:rPr>
+        <w:t>"End"</w:t>
+      </w:r>
+      <w:r>
+        <w:t xml:space="preserve">); </w:t>
+      </w:r>
+      <w:r>
+        <w:rPr>
+          <w:rStyle w:val="e"/>
+        </w:rPr>
+        <w:t>// O(1)</w:t>
+      </w:r>
+      <w:r>
+        <w:br/>
+      </w:r>
+      <w:r>
+        <w:lastRenderedPageBreak/>
+        <w:br/>
+      </w:r>
+      <w:proofErr w:type="spellStart"/>
+      <w:r>
+        <w:rPr>
+          <w:rStyle w:val="m"/>
+        </w:rPr>
+        <w:t>list</w:t>
+      </w:r>
+      <w:r>
+        <w:rPr>
+          <w:rStyle w:val="g"/>
+        </w:rPr>
+        <w:t>.</w:t>
+      </w:r>
+      <w:r>
+        <w:rPr>
+          <w:rStyle w:val="m"/>
+        </w:rPr>
+        <w:t>get</w:t>
+      </w:r>
+      <w:proofErr w:type="spellEnd"/>
+      <w:r>
+        <w:t>(</w:t>
+      </w:r>
+      <w:r>
+        <w:rPr>
+          <w:rStyle w:val="j"/>
+        </w:rPr>
+        <w:t>1</w:t>
+      </w:r>
+      <w:r>
+        <w:t xml:space="preserve">); </w:t>
+      </w:r>
+      <w:r>
+        <w:rPr>
+          <w:rStyle w:val="e"/>
+        </w:rPr>
+        <w:t>// O(n)</w:t>
+      </w:r>
+      <w:r>
+        <w:br/>
+      </w:r>
+      <w:proofErr w:type="spellStart"/>
+      <w:r>
+        <w:rPr>
+          <w:rStyle w:val="m"/>
+        </w:rPr>
+        <w:t>list</w:t>
+      </w:r>
+      <w:r>
+        <w:rPr>
+          <w:rStyle w:val="g"/>
+        </w:rPr>
+        <w:t>.</w:t>
+      </w:r>
+      <w:r>
+        <w:rPr>
+          <w:rStyle w:val="m"/>
+        </w:rPr>
+        <w:t>set</w:t>
+      </w:r>
+      <w:proofErr w:type="spellEnd"/>
+      <w:r>
+        <w:t>(</w:t>
+      </w:r>
+      <w:r>
+        <w:rPr>
+          <w:rStyle w:val="j"/>
+        </w:rPr>
+        <w:t>1</w:t>
+      </w:r>
+      <w:r>
+        <w:t xml:space="preserve">, </w:t>
+      </w:r>
+      <w:r>
+        <w:rPr>
+          <w:rStyle w:val="k"/>
+        </w:rPr>
+        <w:t>"X"</w:t>
+      </w:r>
+      <w:r>
+        <w:t xml:space="preserve">); </w:t>
+      </w:r>
+      <w:r>
+        <w:rPr>
+          <w:rStyle w:val="e"/>
+        </w:rPr>
+        <w:t>// O(n)</w:t>
+      </w:r>
+      <w:r>
+        <w:br/>
+      </w:r>
+      <w:r>
+        <w:br/>
+      </w:r>
+      <w:proofErr w:type="spellStart"/>
+      <w:r>
+        <w:rPr>
+          <w:rStyle w:val="m"/>
+        </w:rPr>
+        <w:t>list</w:t>
+      </w:r>
+      <w:r>
+        <w:rPr>
+          <w:rStyle w:val="g"/>
+        </w:rPr>
+        <w:t>.</w:t>
+      </w:r>
+      <w:r>
+        <w:rPr>
+          <w:rStyle w:val="m"/>
+        </w:rPr>
+        <w:t>contains</w:t>
+      </w:r>
+      <w:proofErr w:type="spellEnd"/>
+      <w:r>
+        <w:t>(</w:t>
+      </w:r>
+      <w:r>
+        <w:rPr>
+          <w:rStyle w:val="k"/>
+        </w:rPr>
+        <w:t>"A"</w:t>
+      </w:r>
+      <w:r>
+        <w:t xml:space="preserve">); </w:t>
+      </w:r>
+      <w:r>
+        <w:rPr>
+          <w:rStyle w:val="e"/>
+        </w:rPr>
+        <w:t>// O(n)</w:t>
+      </w:r>
+      <w:r>
+        <w:br/>
+      </w:r>
+      <w:r>
+        <w:br/>
+      </w:r>
+      <w:proofErr w:type="spellStart"/>
+      <w:r>
+        <w:rPr>
+          <w:rStyle w:val="m"/>
+        </w:rPr>
+        <w:t>list</w:t>
+      </w:r>
+      <w:r>
+        <w:rPr>
+          <w:rStyle w:val="g"/>
+        </w:rPr>
+        <w:t>.</w:t>
+      </w:r>
+      <w:r>
+        <w:rPr>
+          <w:rStyle w:val="m"/>
+        </w:rPr>
+        <w:t>removeFirst</w:t>
+      </w:r>
+      <w:proofErr w:type="spellEnd"/>
+      <w:r>
+        <w:t xml:space="preserve">(); </w:t>
+      </w:r>
+      <w:r>
+        <w:rPr>
+          <w:rStyle w:val="e"/>
+        </w:rPr>
+        <w:t>// O(1)</w:t>
+      </w:r>
+      <w:r>
+        <w:br/>
+      </w:r>
+      <w:proofErr w:type="spellStart"/>
+      <w:r>
+        <w:rPr>
+          <w:rStyle w:val="m"/>
+        </w:rPr>
+        <w:t>list</w:t>
+      </w:r>
+      <w:r>
+        <w:rPr>
+          <w:rStyle w:val="g"/>
+        </w:rPr>
+        <w:t>.</w:t>
+      </w:r>
+      <w:r>
+        <w:rPr>
+          <w:rStyle w:val="m"/>
+        </w:rPr>
+        <w:t>removeLast</w:t>
+      </w:r>
+      <w:proofErr w:type="spellEnd"/>
+      <w:r>
+        <w:t xml:space="preserve">(); </w:t>
+      </w:r>
+      <w:r>
+        <w:rPr>
+          <w:rStyle w:val="e"/>
+        </w:rPr>
+        <w:t>// O(1)</w:t>
+      </w:r>
+      <w:r>
+        <w:br/>
+      </w:r>
+      <w:r>
+        <w:br/>
+      </w:r>
+      <w:proofErr w:type="spellStart"/>
+      <w:r>
+        <w:rPr>
+          <w:rStyle w:val="m"/>
+        </w:rPr>
+        <w:t>list</w:t>
+      </w:r>
+      <w:r>
+        <w:rPr>
+          <w:rStyle w:val="g"/>
+        </w:rPr>
+        <w:t>.</w:t>
+      </w:r>
+      <w:r>
+        <w:rPr>
+          <w:rStyle w:val="m"/>
+        </w:rPr>
+        <w:t>size</w:t>
+      </w:r>
+      <w:proofErr w:type="spellEnd"/>
+      <w:r>
+        <w:t xml:space="preserve">(); </w:t>
+      </w:r>
+      <w:r>
+        <w:rPr>
+          <w:rStyle w:val="e"/>
+        </w:rPr>
+        <w:t>// O(1)</w:t>
+      </w:r>
+      <w:r>
+        <w:br/>
+      </w:r>
+      <w:r>
+        <w:br/>
+      </w:r>
+      <w:r>
+        <w:rPr>
+          <w:rStyle w:val="g"/>
+        </w:rPr>
+        <w:t>for</w:t>
+      </w:r>
+      <w:r>
+        <w:t xml:space="preserve"> (</w:t>
+      </w:r>
+      <w:r>
+        <w:rPr>
+          <w:rStyle w:val="m"/>
+        </w:rPr>
+        <w:t>String</w:t>
+      </w:r>
+      <w:r>
+        <w:t xml:space="preserve"> </w:t>
+      </w:r>
+      <w:r>
+        <w:rPr>
+          <w:rStyle w:val="m"/>
+        </w:rPr>
+        <w:t>s</w:t>
+      </w:r>
+      <w:r>
+        <w:t xml:space="preserve"> : </w:t>
+      </w:r>
+      <w:r>
+        <w:rPr>
+          <w:rStyle w:val="m"/>
+        </w:rPr>
+        <w:t>list</w:t>
+      </w:r>
+      <w:r>
+        <w:t xml:space="preserve">) { </w:t>
+      </w:r>
+      <w:r>
+        <w:rPr>
+          <w:rStyle w:val="e"/>
+        </w:rPr>
+        <w:t>// O(n)</w:t>
+      </w:r>
+      <w:r>
+        <w:br/>
+      </w:r>
+      <w:r>
+        <w:rPr>
+          <w:rStyle w:val="m"/>
+        </w:rPr>
+        <w:t>System</w:t>
+      </w:r>
+      <w:r>
+        <w:rPr>
+          <w:rStyle w:val="g"/>
+        </w:rPr>
+        <w:t>.</w:t>
+      </w:r>
+      <w:r>
+        <w:rPr>
+          <w:rStyle w:val="m"/>
+        </w:rPr>
+        <w:t>out</w:t>
+      </w:r>
+      <w:r>
+        <w:rPr>
+          <w:rStyle w:val="g"/>
+        </w:rPr>
+        <w:t>.</w:t>
+      </w:r>
+      <w:r>
+        <w:rPr>
+          <w:rStyle w:val="m"/>
+        </w:rPr>
+        <w:t>println</w:t>
+      </w:r>
+      <w:r>
+        <w:t>(</w:t>
+      </w:r>
+      <w:r>
+        <w:rPr>
+          <w:rStyle w:val="m"/>
+        </w:rPr>
+        <w:t>s</w:t>
+      </w:r>
+      <w:r>
+        <w:t>);</w:t>
+      </w:r>
+      <w:r>
+        <w:br/>
+        <w:t>}</w:t>
+      </w:r>
+      <w:r>
+        <w:br/>
+        <w:t>}</w:t>
+      </w:r>
+      <w:r>
+        <w:br/>
+        <w:t>}</w:t>
+      </w:r>
+    </w:p>
+    <w:p/>
+    <w:p>
+      <w:pPr>
+        <w:spacing w:before="100" w:beforeAutospacing="1" w:after="100" w:afterAutospacing="1" w:line="240" w:lineRule="auto"/>
+        <w:outlineLvl w:val="0"/>
+        <w:rPr>
+          <w:rFonts w:ascii="Times New Roman" w:eastAsia="Times New Roman" w:hAnsi="Times New Roman" w:cs="Times New Roman"/>
+          <w:b/>
+          <w:bCs/>
+          <w:kern w:val="36"/>
+          <w:sz w:val="48"/>
+          <w:szCs w:val="48"/>
+          <w:highlight w:val="red"/>
+          <w:lang w:eastAsia="en-IN"/>
+        </w:rPr>
+      </w:pPr>
+      <w:r>
+        <w:rPr>
+          <w:rFonts w:ascii="Times New Roman" w:eastAsia="Times New Roman" w:hAnsi="Times New Roman" w:cs="Times New Roman"/>
+          <w:b/>
+          <w:bCs/>
+          <w:kern w:val="36"/>
+          <w:sz w:val="48"/>
+          <w:szCs w:val="48"/>
+          <w:highlight w:val="red"/>
+          <w:lang w:eastAsia="en-IN"/>
+        </w:rPr>
+        <w:t>2.</w:t>
+      </w:r>
+      <w:r>
+        <w:rPr>
+          <w:rFonts w:ascii="Times New Roman" w:eastAsia="Times New Roman" w:hAnsi="Times New Roman" w:cs="Times New Roman"/>
+          <w:b/>
+          <w:bCs/>
+          <w:kern w:val="36"/>
+          <w:sz w:val="48"/>
+          <w:szCs w:val="48"/>
+          <w:highlight w:val="red"/>
+          <w:lang w:eastAsia="en-IN"/>
+        </w:rPr>
+        <w:t>3</w:t>
+      </w:r>
+      <w:r>
+        <w:rPr>
+          <w:rFonts w:ascii="Times New Roman" w:eastAsia="Times New Roman" w:hAnsi="Times New Roman" w:cs="Times New Roman"/>
+          <w:b/>
+          <w:bCs/>
+          <w:kern w:val="36"/>
+          <w:sz w:val="48"/>
+          <w:szCs w:val="48"/>
+          <w:highlight w:val="red"/>
+          <w:lang w:eastAsia="en-IN"/>
+        </w:rPr>
+        <w:t xml:space="preserve"> </w:t>
+      </w:r>
       <w:r>
         <w:rPr>
           <w:rFonts w:ascii="Times New Roman" w:eastAsia="Times New Roman" w:hAnsi="Times New Roman" w:cs="Times New Roman"/>
@@ -5396,6 +5500,47 @@
           <w:highlight w:val="red"/>
           <w:lang w:eastAsia="en-IN"/>
         </w:rPr>
+        <w:t>2.</w:t>
+      </w:r>
+      <w:r>
+        <w:rPr>
+          <w:rFonts w:ascii="Times New Roman" w:eastAsia="Times New Roman" w:hAnsi="Times New Roman" w:cs="Times New Roman"/>
+          <w:b/>
+          <w:bCs/>
+          <w:kern w:val="36"/>
+          <w:sz w:val="48"/>
+          <w:szCs w:val="48"/>
+          <w:highlight w:val="red"/>
+          <w:lang w:eastAsia="en-IN"/>
+        </w:rPr>
+        <w:t>4</w:t>
+      </w:r>
+      <w:bookmarkStart w:id="0" w:name="_GoBack"/>
+      <w:bookmarkEnd w:id="0"/>
+      <w:r>
+        <w:rPr>
+          <w:rFonts w:ascii="Times New Roman" w:eastAsia="Times New Roman" w:hAnsi="Times New Roman" w:cs="Times New Roman"/>
+          <w:b/>
+          <w:bCs/>
+          <w:kern w:val="36"/>
+          <w:sz w:val="48"/>
+          <w:szCs w:val="48"/>
+          <w:highlight w:val="red"/>
+          <w:lang w:eastAsia="en-IN"/>
+        </w:rPr>
+        <w:t xml:space="preserve"> </w:t>
+      </w:r>
+      <w:r>
+        <w:rPr>
+          <w:rFonts w:ascii="Times New Roman" w:eastAsia="Times New Roman" w:hAnsi="Times New Roman" w:cs="Times New Roman"/>
+          <w:b/>
+          <w:bCs/>
+          <w:kern w:val="36"/>
+          <w:sz w:val="48"/>
+          <w:szCs w:val="48"/>
+          <w:highlight w:val="red"/>
+          <w:lang w:eastAsia="en-IN"/>
+        </w:rPr>
         <w:t>Stack</w:t>
       </w:r>
     </w:p>
@@ -6559,8 +6704,6 @@
         </w:rPr>
         <w:t>;</w:t>
       </w:r>
-      <w:bookmarkStart w:id="0" w:name="_GoBack"/>
-      <w:bookmarkEnd w:id="0"/>
       <w:r>
         <w:rPr>
           <w:rFonts w:ascii="Courier New" w:eastAsia="Times New Roman" w:hAnsi="Courier New" w:cs="Courier New"/>
@@ -7059,6 +7202,674 @@
       </w:r>
     </w:p>
     <w:p/>
+    <w:p>
+      <w:pPr>
+        <w:spacing w:before="100" w:beforeAutospacing="1" w:after="100" w:afterAutospacing="1" w:line="240" w:lineRule="auto"/>
+        <w:outlineLvl w:val="0"/>
+        <w:rPr>
+          <w:rFonts w:ascii="Times New Roman" w:eastAsia="Times New Roman" w:hAnsi="Times New Roman" w:cs="Times New Roman"/>
+          <w:b/>
+          <w:bCs/>
+          <w:kern w:val="36"/>
+          <w:sz w:val="48"/>
+          <w:szCs w:val="48"/>
+          <w:highlight w:val="yellow"/>
+          <w:lang w:eastAsia="en-IN"/>
+        </w:rPr>
+      </w:pPr>
+      <w:r>
+        <w:rPr>
+          <w:rFonts w:ascii="Times New Roman" w:eastAsia="Times New Roman" w:hAnsi="Times New Roman" w:cs="Times New Roman"/>
+          <w:b/>
+          <w:bCs/>
+          <w:kern w:val="36"/>
+          <w:sz w:val="48"/>
+          <w:szCs w:val="48"/>
+          <w:highlight w:val="yellow"/>
+          <w:lang w:eastAsia="en-IN"/>
+        </w:rPr>
+        <w:t xml:space="preserve">3. </w:t>
+      </w:r>
+      <w:r>
+        <w:rPr>
+          <w:rFonts w:ascii="Times New Roman" w:eastAsia="Times New Roman" w:hAnsi="Times New Roman" w:cs="Times New Roman"/>
+          <w:b/>
+          <w:bCs/>
+          <w:kern w:val="36"/>
+          <w:sz w:val="48"/>
+          <w:szCs w:val="48"/>
+          <w:highlight w:val="yellow"/>
+          <w:lang w:eastAsia="en-IN"/>
+        </w:rPr>
+        <w:t>Set</w:t>
+      </w:r>
+    </w:p>
+    <w:p>
+      <w:pPr>
+        <w:spacing w:before="100" w:beforeAutospacing="1" w:after="100" w:afterAutospacing="1" w:line="240" w:lineRule="auto"/>
+        <w:outlineLvl w:val="2"/>
+        <w:rPr>
+          <w:rFonts w:ascii="Times New Roman" w:eastAsia="Times New Roman" w:hAnsi="Times New Roman" w:cs="Times New Roman"/>
+          <w:b/>
+          <w:bCs/>
+          <w:sz w:val="27"/>
+          <w:szCs w:val="27"/>
+          <w:lang w:eastAsia="en-IN"/>
+        </w:rPr>
+      </w:pPr>
+      <w:r>
+        <w:rPr>
+          <w:rFonts w:ascii="Times New Roman" w:eastAsia="Times New Roman" w:hAnsi="Times New Roman" w:cs="Times New Roman"/>
+          <w:b/>
+          <w:bCs/>
+          <w:sz w:val="27"/>
+          <w:szCs w:val="27"/>
+          <w:lang w:eastAsia="en-IN"/>
+        </w:rPr>
+        <w:t>Definition</w:t>
+      </w:r>
+    </w:p>
+    <w:p>
+      <w:pPr>
+        <w:spacing w:beforeAutospacing="1" w:after="100" w:afterAutospacing="1" w:line="240" w:lineRule="auto"/>
+        <w:rPr>
+          <w:rFonts w:ascii="Times New Roman" w:eastAsia="Times New Roman" w:hAnsi="Times New Roman" w:cs="Times New Roman"/>
+          <w:sz w:val="24"/>
+          <w:szCs w:val="24"/>
+          <w:lang w:eastAsia="en-IN"/>
+        </w:rPr>
+      </w:pPr>
+      <w:r>
+        <w:rPr>
+          <w:rFonts w:ascii="Times New Roman" w:eastAsia="Times New Roman" w:hAnsi="Times New Roman" w:cs="Times New Roman"/>
+          <w:sz w:val="24"/>
+          <w:szCs w:val="24"/>
+          <w:lang w:eastAsia="en-IN"/>
+        </w:rPr>
+        <w:t>Set is an interface that defines rules for storing unique elements.</w:t>
+      </w:r>
+    </w:p>
+    <w:p>
+      <w:pPr>
+        <w:spacing w:before="100" w:beforeAutospacing="1" w:after="100" w:afterAutospacing="1" w:line="240" w:lineRule="auto"/>
+        <w:outlineLvl w:val="2"/>
+        <w:rPr>
+          <w:rFonts w:ascii="Times New Roman" w:eastAsia="Times New Roman" w:hAnsi="Times New Roman" w:cs="Times New Roman"/>
+          <w:b/>
+          <w:bCs/>
+          <w:sz w:val="27"/>
+          <w:szCs w:val="27"/>
+          <w:lang w:eastAsia="en-IN"/>
+        </w:rPr>
+      </w:pPr>
+      <w:r>
+        <w:rPr>
+          <w:rFonts w:ascii="Times New Roman" w:eastAsia="Times New Roman" w:hAnsi="Times New Roman" w:cs="Times New Roman"/>
+          <w:b/>
+          <w:bCs/>
+          <w:sz w:val="27"/>
+          <w:szCs w:val="27"/>
+          <w:lang w:eastAsia="en-IN"/>
+        </w:rPr>
+        <w:t>Rules</w:t>
+      </w:r>
+    </w:p>
+    <w:p>
+      <w:pPr>
+        <w:tabs>
+          <w:tab w:val="left" w:pos="916"/>
+          <w:tab w:val="left" w:pos="1832"/>
+          <w:tab w:val="left" w:pos="2748"/>
+          <w:tab w:val="left" w:pos="3664"/>
+          <w:tab w:val="left" w:pos="4580"/>
+          <w:tab w:val="left" w:pos="5496"/>
+          <w:tab w:val="left" w:pos="6412"/>
+          <w:tab w:val="left" w:pos="7328"/>
+          <w:tab w:val="left" w:pos="8244"/>
+          <w:tab w:val="left" w:pos="9160"/>
+          <w:tab w:val="left" w:pos="10076"/>
+          <w:tab w:val="left" w:pos="10992"/>
+          <w:tab w:val="left" w:pos="11908"/>
+          <w:tab w:val="left" w:pos="12824"/>
+          <w:tab w:val="left" w:pos="13740"/>
+          <w:tab w:val="left" w:pos="14656"/>
+        </w:tabs>
+        <w:spacing w:after="0" w:line="240" w:lineRule="auto"/>
+        <w:rPr>
+          <w:rFonts w:ascii="Courier New" w:eastAsia="Times New Roman" w:hAnsi="Courier New" w:cs="Courier New"/>
+          <w:sz w:val="20"/>
+          <w:szCs w:val="20"/>
+          <w:lang w:eastAsia="en-IN"/>
+        </w:rPr>
+      </w:pPr>
+      <w:r>
+        <w:rPr>
+          <w:rFonts w:ascii="Courier New" w:eastAsia="Times New Roman" w:hAnsi="Courier New" w:cs="Courier New"/>
+          <w:sz w:val="20"/>
+          <w:szCs w:val="20"/>
+          <w:lang w:eastAsia="en-IN"/>
+        </w:rPr>
+        <w:t>Order      ❌ Depends on Implementation</w:t>
+      </w:r>
+      <w:r>
+        <w:rPr>
+          <w:rFonts w:ascii="Courier New" w:eastAsia="Times New Roman" w:hAnsi="Courier New" w:cs="Courier New"/>
+          <w:sz w:val="20"/>
+          <w:szCs w:val="20"/>
+          <w:lang w:eastAsia="en-IN"/>
+        </w:rPr>
+        <w:br/>
+      </w:r>
+      <w:proofErr w:type="gramStart"/>
+      <w:r>
+        <w:rPr>
+          <w:rFonts w:ascii="Courier New" w:eastAsia="Times New Roman" w:hAnsi="Courier New" w:cs="Courier New"/>
+          <w:sz w:val="20"/>
+          <w:szCs w:val="20"/>
+          <w:lang w:eastAsia="en-IN"/>
+        </w:rPr>
+        <w:t>Duplicate  ❌</w:t>
+      </w:r>
+      <w:proofErr w:type="gramEnd"/>
+      <w:r>
+        <w:rPr>
+          <w:rFonts w:ascii="Courier New" w:eastAsia="Times New Roman" w:hAnsi="Courier New" w:cs="Courier New"/>
+          <w:sz w:val="20"/>
+          <w:szCs w:val="20"/>
+          <w:lang w:eastAsia="en-IN"/>
+        </w:rPr>
+        <w:t xml:space="preserve"> Not Allowed</w:t>
+      </w:r>
+      <w:r>
+        <w:rPr>
+          <w:rFonts w:ascii="Courier New" w:eastAsia="Times New Roman" w:hAnsi="Courier New" w:cs="Courier New"/>
+          <w:sz w:val="20"/>
+          <w:szCs w:val="20"/>
+          <w:lang w:eastAsia="en-IN"/>
+        </w:rPr>
+        <w:br/>
+        <w:t>Null       Depends on Implementation</w:t>
+      </w:r>
+      <w:r>
+        <w:rPr>
+          <w:rFonts w:ascii="Courier New" w:eastAsia="Times New Roman" w:hAnsi="Courier New" w:cs="Courier New"/>
+          <w:sz w:val="20"/>
+          <w:szCs w:val="20"/>
+          <w:lang w:eastAsia="en-IN"/>
+        </w:rPr>
+        <w:br/>
+        <w:t>Index      ❌</w:t>
+      </w:r>
+    </w:p>
+    <w:p>
+      <w:pPr>
+        <w:spacing w:before="100" w:beforeAutospacing="1" w:after="100" w:afterAutospacing="1" w:line="240" w:lineRule="auto"/>
+        <w:outlineLvl w:val="2"/>
+        <w:rPr>
+          <w:rFonts w:ascii="Times New Roman" w:eastAsia="Times New Roman" w:hAnsi="Times New Roman" w:cs="Times New Roman"/>
+          <w:b/>
+          <w:bCs/>
+          <w:sz w:val="27"/>
+          <w:szCs w:val="27"/>
+          <w:lang w:eastAsia="en-IN"/>
+        </w:rPr>
+      </w:pPr>
+      <w:r>
+        <w:rPr>
+          <w:rFonts w:ascii="Times New Roman" w:eastAsia="Times New Roman" w:hAnsi="Times New Roman" w:cs="Times New Roman"/>
+          <w:b/>
+          <w:bCs/>
+          <w:sz w:val="27"/>
+          <w:szCs w:val="27"/>
+          <w:lang w:eastAsia="en-IN"/>
+        </w:rPr>
+        <w:t>Who follows these rules?</w:t>
+      </w:r>
+    </w:p>
+    <w:p>
+      <w:pPr>
+        <w:numPr>
+          <w:ilvl w:val="0"/>
+          <w:numId w:val="9"/>
+        </w:numPr>
+        <w:spacing w:before="100" w:beforeAutospacing="1" w:after="100" w:afterAutospacing="1" w:line="240" w:lineRule="auto"/>
+        <w:rPr>
+          <w:rFonts w:ascii="Times New Roman" w:eastAsia="Times New Roman" w:hAnsi="Times New Roman" w:cs="Times New Roman"/>
+          <w:sz w:val="24"/>
+          <w:szCs w:val="24"/>
+          <w:lang w:eastAsia="en-IN"/>
+        </w:rPr>
+      </w:pPr>
+      <w:proofErr w:type="spellStart"/>
+      <w:r>
+        <w:rPr>
+          <w:rFonts w:ascii="Times New Roman" w:eastAsia="Times New Roman" w:hAnsi="Times New Roman" w:cs="Times New Roman"/>
+          <w:sz w:val="24"/>
+          <w:szCs w:val="24"/>
+          <w:lang w:eastAsia="en-IN"/>
+        </w:rPr>
+        <w:t>HashSet</w:t>
+      </w:r>
+      <w:proofErr w:type="spellEnd"/>
+      <w:r>
+        <w:rPr>
+          <w:rFonts w:ascii="Times New Roman" w:eastAsia="Times New Roman" w:hAnsi="Times New Roman" w:cs="Times New Roman"/>
+          <w:sz w:val="24"/>
+          <w:szCs w:val="24"/>
+          <w:lang w:eastAsia="en-IN"/>
+        </w:rPr>
+        <w:t xml:space="preserve"> </w:t>
+      </w:r>
+    </w:p>
+    <w:p>
+      <w:pPr>
+        <w:numPr>
+          <w:ilvl w:val="0"/>
+          <w:numId w:val="9"/>
+        </w:numPr>
+        <w:spacing w:before="100" w:beforeAutospacing="1" w:after="100" w:afterAutospacing="1" w:line="240" w:lineRule="auto"/>
+        <w:rPr>
+          <w:rFonts w:ascii="Times New Roman" w:eastAsia="Times New Roman" w:hAnsi="Times New Roman" w:cs="Times New Roman"/>
+          <w:sz w:val="24"/>
+          <w:szCs w:val="24"/>
+          <w:lang w:eastAsia="en-IN"/>
+        </w:rPr>
+      </w:pPr>
+      <w:proofErr w:type="spellStart"/>
+      <w:r>
+        <w:rPr>
+          <w:rFonts w:ascii="Times New Roman" w:eastAsia="Times New Roman" w:hAnsi="Times New Roman" w:cs="Times New Roman"/>
+          <w:sz w:val="24"/>
+          <w:szCs w:val="24"/>
+          <w:lang w:eastAsia="en-IN"/>
+        </w:rPr>
+        <w:t>LinkedHashSet</w:t>
+      </w:r>
+      <w:proofErr w:type="spellEnd"/>
+      <w:r>
+        <w:rPr>
+          <w:rFonts w:ascii="Times New Roman" w:eastAsia="Times New Roman" w:hAnsi="Times New Roman" w:cs="Times New Roman"/>
+          <w:sz w:val="24"/>
+          <w:szCs w:val="24"/>
+          <w:lang w:eastAsia="en-IN"/>
+        </w:rPr>
+        <w:t xml:space="preserve"> </w:t>
+      </w:r>
+    </w:p>
+    <w:p>
+      <w:pPr>
+        <w:numPr>
+          <w:ilvl w:val="0"/>
+          <w:numId w:val="9"/>
+        </w:numPr>
+        <w:spacing w:before="100" w:beforeAutospacing="1" w:after="100" w:afterAutospacing="1" w:line="240" w:lineRule="auto"/>
+        <w:rPr>
+          <w:rFonts w:ascii="Times New Roman" w:eastAsia="Times New Roman" w:hAnsi="Times New Roman" w:cs="Times New Roman"/>
+          <w:sz w:val="24"/>
+          <w:szCs w:val="24"/>
+          <w:lang w:eastAsia="en-IN"/>
+        </w:rPr>
+      </w:pPr>
+      <w:proofErr w:type="spellStart"/>
+      <w:r>
+        <w:rPr>
+          <w:rFonts w:ascii="Times New Roman" w:eastAsia="Times New Roman" w:hAnsi="Times New Roman" w:cs="Times New Roman"/>
+          <w:sz w:val="24"/>
+          <w:szCs w:val="24"/>
+          <w:lang w:eastAsia="en-IN"/>
+        </w:rPr>
+        <w:t>TreeSet</w:t>
+      </w:r>
+      <w:proofErr w:type="spellEnd"/>
+      <w:r>
+        <w:rPr>
+          <w:rFonts w:ascii="Times New Roman" w:eastAsia="Times New Roman" w:hAnsi="Times New Roman" w:cs="Times New Roman"/>
+          <w:sz w:val="24"/>
+          <w:szCs w:val="24"/>
+          <w:lang w:eastAsia="en-IN"/>
+        </w:rPr>
+        <w:t xml:space="preserve"> </w:t>
+      </w:r>
+    </w:p>
+    <w:p>
+      <w:pPr>
+        <w:tabs>
+          <w:tab w:val="left" w:pos="916"/>
+          <w:tab w:val="left" w:pos="1832"/>
+          <w:tab w:val="left" w:pos="2748"/>
+          <w:tab w:val="left" w:pos="3664"/>
+          <w:tab w:val="left" w:pos="4580"/>
+          <w:tab w:val="left" w:pos="5496"/>
+          <w:tab w:val="left" w:pos="6412"/>
+          <w:tab w:val="left" w:pos="7328"/>
+          <w:tab w:val="left" w:pos="8244"/>
+          <w:tab w:val="left" w:pos="9160"/>
+          <w:tab w:val="left" w:pos="10076"/>
+          <w:tab w:val="left" w:pos="10992"/>
+          <w:tab w:val="left" w:pos="11908"/>
+          <w:tab w:val="left" w:pos="12824"/>
+          <w:tab w:val="left" w:pos="13740"/>
+          <w:tab w:val="left" w:pos="14656"/>
+        </w:tabs>
+        <w:spacing w:after="0" w:line="240" w:lineRule="auto"/>
+        <w:rPr>
+          <w:rFonts w:ascii="Courier New" w:eastAsia="Times New Roman" w:hAnsi="Courier New" w:cs="Courier New"/>
+          <w:sz w:val="20"/>
+          <w:szCs w:val="20"/>
+          <w:lang w:eastAsia="en-IN"/>
+        </w:rPr>
+      </w:pPr>
+      <w:r>
+        <w:rPr>
+          <w:rFonts w:ascii="Courier New" w:eastAsia="Times New Roman" w:hAnsi="Courier New" w:cs="Courier New"/>
+          <w:sz w:val="20"/>
+          <w:szCs w:val="20"/>
+          <w:lang w:eastAsia="en-IN"/>
+        </w:rPr>
+        <w:lastRenderedPageBreak/>
+        <w:t xml:space="preserve">        Set</w:t>
+      </w:r>
+      <w:r>
+        <w:rPr>
+          <w:rFonts w:ascii="Courier New" w:eastAsia="Times New Roman" w:hAnsi="Courier New" w:cs="Courier New"/>
+          <w:sz w:val="20"/>
+          <w:szCs w:val="20"/>
+          <w:lang w:eastAsia="en-IN"/>
+        </w:rPr>
+        <w:br/>
+        <w:t xml:space="preserve">         |</w:t>
+      </w:r>
+      <w:r>
+        <w:rPr>
+          <w:rFonts w:ascii="Courier New" w:eastAsia="Times New Roman" w:hAnsi="Courier New" w:cs="Courier New"/>
+          <w:sz w:val="20"/>
+          <w:szCs w:val="20"/>
+          <w:lang w:eastAsia="en-IN"/>
+        </w:rPr>
+        <w:br/>
+        <w:t xml:space="preserve"> -------------------</w:t>
+      </w:r>
+      <w:r>
+        <w:rPr>
+          <w:rFonts w:ascii="Courier New" w:eastAsia="Times New Roman" w:hAnsi="Courier New" w:cs="Courier New"/>
+          <w:sz w:val="20"/>
+          <w:szCs w:val="20"/>
+          <w:lang w:eastAsia="en-IN"/>
+        </w:rPr>
+        <w:br/>
+        <w:t xml:space="preserve"> |        |         |</w:t>
+      </w:r>
+      <w:r>
+        <w:rPr>
+          <w:rFonts w:ascii="Courier New" w:eastAsia="Times New Roman" w:hAnsi="Courier New" w:cs="Courier New"/>
+          <w:sz w:val="20"/>
+          <w:szCs w:val="20"/>
+          <w:lang w:eastAsia="en-IN"/>
+        </w:rPr>
+        <w:br/>
+      </w:r>
+      <w:proofErr w:type="spellStart"/>
+      <w:r>
+        <w:rPr>
+          <w:rFonts w:ascii="Courier New" w:eastAsia="Times New Roman" w:hAnsi="Courier New" w:cs="Courier New"/>
+          <w:sz w:val="20"/>
+          <w:szCs w:val="20"/>
+          <w:lang w:eastAsia="en-IN"/>
+        </w:rPr>
+        <w:t>HashSet</w:t>
+      </w:r>
+      <w:proofErr w:type="spellEnd"/>
+      <w:r>
+        <w:rPr>
+          <w:rFonts w:ascii="Courier New" w:eastAsia="Times New Roman" w:hAnsi="Courier New" w:cs="Courier New"/>
+          <w:sz w:val="20"/>
+          <w:szCs w:val="20"/>
+          <w:lang w:eastAsia="en-IN"/>
+        </w:rPr>
+        <w:t xml:space="preserve"> </w:t>
+      </w:r>
+      <w:proofErr w:type="spellStart"/>
+      <w:r>
+        <w:rPr>
+          <w:rFonts w:ascii="Courier New" w:eastAsia="Times New Roman" w:hAnsi="Courier New" w:cs="Courier New"/>
+          <w:sz w:val="20"/>
+          <w:szCs w:val="20"/>
+          <w:lang w:eastAsia="en-IN"/>
+        </w:rPr>
+        <w:t>LinkedHashSet</w:t>
+      </w:r>
+      <w:proofErr w:type="spellEnd"/>
+      <w:r>
+        <w:rPr>
+          <w:rFonts w:ascii="Courier New" w:eastAsia="Times New Roman" w:hAnsi="Courier New" w:cs="Courier New"/>
+          <w:sz w:val="20"/>
+          <w:szCs w:val="20"/>
+          <w:lang w:eastAsia="en-IN"/>
+        </w:rPr>
+        <w:t xml:space="preserve"> </w:t>
+      </w:r>
+      <w:proofErr w:type="spellStart"/>
+      <w:r>
+        <w:rPr>
+          <w:rFonts w:ascii="Courier New" w:eastAsia="Times New Roman" w:hAnsi="Courier New" w:cs="Courier New"/>
+          <w:sz w:val="20"/>
+          <w:szCs w:val="20"/>
+          <w:lang w:eastAsia="en-IN"/>
+        </w:rPr>
+        <w:t>TreeSet</w:t>
+      </w:r>
+      <w:proofErr w:type="spellEnd"/>
+    </w:p>
+    <w:p>
+      <w:pPr>
+        <w:spacing w:before="100" w:beforeAutospacing="1" w:after="100" w:afterAutospacing="1" w:line="240" w:lineRule="auto"/>
+        <w:outlineLvl w:val="2"/>
+        <w:rPr>
+          <w:rFonts w:ascii="Times New Roman" w:eastAsia="Times New Roman" w:hAnsi="Times New Roman" w:cs="Times New Roman"/>
+          <w:b/>
+          <w:bCs/>
+          <w:sz w:val="27"/>
+          <w:szCs w:val="27"/>
+          <w:lang w:eastAsia="en-IN"/>
+        </w:rPr>
+      </w:pPr>
+      <w:r>
+        <w:rPr>
+          <w:rFonts w:ascii="Times New Roman" w:eastAsia="Times New Roman" w:hAnsi="Times New Roman" w:cs="Times New Roman"/>
+          <w:b/>
+          <w:bCs/>
+          <w:sz w:val="27"/>
+          <w:szCs w:val="27"/>
+          <w:lang w:eastAsia="en-IN"/>
+        </w:rPr>
+        <w:t>Simple Interview Definition</w:t>
+      </w:r>
+    </w:p>
+    <w:p>
+      <w:pPr>
+        <w:spacing w:beforeAutospacing="1" w:after="100" w:afterAutospacing="1" w:line="240" w:lineRule="auto"/>
+        <w:rPr>
+          <w:rFonts w:ascii="Times New Roman" w:eastAsia="Times New Roman" w:hAnsi="Times New Roman" w:cs="Times New Roman"/>
+          <w:sz w:val="24"/>
+          <w:szCs w:val="24"/>
+          <w:lang w:eastAsia="en-IN"/>
+        </w:rPr>
+      </w:pPr>
+      <w:r>
+        <w:rPr>
+          <w:rFonts w:ascii="Times New Roman" w:eastAsia="Times New Roman" w:hAnsi="Times New Roman" w:cs="Times New Roman"/>
+          <w:sz w:val="24"/>
+          <w:szCs w:val="24"/>
+          <w:lang w:eastAsia="en-IN"/>
+        </w:rPr>
+        <w:t xml:space="preserve">Set is an interface that defines rules for storing unique elements. </w:t>
+      </w:r>
+      <w:proofErr w:type="spellStart"/>
+      <w:r>
+        <w:rPr>
+          <w:rFonts w:ascii="Times New Roman" w:eastAsia="Times New Roman" w:hAnsi="Times New Roman" w:cs="Times New Roman"/>
+          <w:sz w:val="24"/>
+          <w:szCs w:val="24"/>
+          <w:lang w:eastAsia="en-IN"/>
+        </w:rPr>
+        <w:t>HashSet</w:t>
+      </w:r>
+      <w:proofErr w:type="spellEnd"/>
+      <w:r>
+        <w:rPr>
+          <w:rFonts w:ascii="Times New Roman" w:eastAsia="Times New Roman" w:hAnsi="Times New Roman" w:cs="Times New Roman"/>
+          <w:sz w:val="24"/>
+          <w:szCs w:val="24"/>
+          <w:lang w:eastAsia="en-IN"/>
+        </w:rPr>
+        <w:t xml:space="preserve">, </w:t>
+      </w:r>
+      <w:proofErr w:type="spellStart"/>
+      <w:r>
+        <w:rPr>
+          <w:rFonts w:ascii="Times New Roman" w:eastAsia="Times New Roman" w:hAnsi="Times New Roman" w:cs="Times New Roman"/>
+          <w:sz w:val="24"/>
+          <w:szCs w:val="24"/>
+          <w:lang w:eastAsia="en-IN"/>
+        </w:rPr>
+        <w:t>LinkedHashSet</w:t>
+      </w:r>
+      <w:proofErr w:type="spellEnd"/>
+      <w:r>
+        <w:rPr>
+          <w:rFonts w:ascii="Times New Roman" w:eastAsia="Times New Roman" w:hAnsi="Times New Roman" w:cs="Times New Roman"/>
+          <w:sz w:val="24"/>
+          <w:szCs w:val="24"/>
+          <w:lang w:eastAsia="en-IN"/>
+        </w:rPr>
+        <w:t xml:space="preserve">, and </w:t>
+      </w:r>
+      <w:proofErr w:type="spellStart"/>
+      <w:r>
+        <w:rPr>
+          <w:rFonts w:ascii="Times New Roman" w:eastAsia="Times New Roman" w:hAnsi="Times New Roman" w:cs="Times New Roman"/>
+          <w:sz w:val="24"/>
+          <w:szCs w:val="24"/>
+          <w:lang w:eastAsia="en-IN"/>
+        </w:rPr>
+        <w:t>TreeSet</w:t>
+      </w:r>
+      <w:proofErr w:type="spellEnd"/>
+      <w:r>
+        <w:rPr>
+          <w:rFonts w:ascii="Times New Roman" w:eastAsia="Times New Roman" w:hAnsi="Times New Roman" w:cs="Times New Roman"/>
+          <w:sz w:val="24"/>
+          <w:szCs w:val="24"/>
+          <w:lang w:eastAsia="en-IN"/>
+        </w:rPr>
+        <w:t xml:space="preserve"> implement these rules and store the actual data.</w:t>
+      </w:r>
+    </w:p>
+    <w:p>
+      <w:pPr>
+        <w:spacing w:before="100" w:beforeAutospacing="1" w:after="100" w:afterAutospacing="1" w:line="240" w:lineRule="auto"/>
+        <w:outlineLvl w:val="2"/>
+        <w:rPr>
+          <w:rFonts w:ascii="Times New Roman" w:eastAsia="Times New Roman" w:hAnsi="Times New Roman" w:cs="Times New Roman"/>
+          <w:b/>
+          <w:bCs/>
+          <w:sz w:val="27"/>
+          <w:szCs w:val="27"/>
+          <w:lang w:eastAsia="en-IN"/>
+        </w:rPr>
+      </w:pPr>
+      <w:r>
+        <w:rPr>
+          <w:rFonts w:ascii="Times New Roman" w:eastAsia="Times New Roman" w:hAnsi="Times New Roman" w:cs="Times New Roman"/>
+          <w:b/>
+          <w:bCs/>
+          <w:sz w:val="27"/>
+          <w:szCs w:val="27"/>
+          <w:lang w:eastAsia="en-IN"/>
+        </w:rPr>
+        <w:t>One-Liner</w:t>
+      </w:r>
+    </w:p>
+    <w:p>
+      <w:pPr>
+        <w:spacing w:beforeAutospacing="1" w:after="100" w:afterAutospacing="1" w:line="240" w:lineRule="auto"/>
+        <w:rPr>
+          <w:rFonts w:ascii="Times New Roman" w:eastAsia="Times New Roman" w:hAnsi="Times New Roman" w:cs="Times New Roman"/>
+          <w:sz w:val="24"/>
+          <w:szCs w:val="24"/>
+          <w:lang w:eastAsia="en-IN"/>
+        </w:rPr>
+      </w:pPr>
+      <w:r>
+        <w:rPr>
+          <w:rFonts w:ascii="Times New Roman" w:eastAsia="Times New Roman" w:hAnsi="Times New Roman" w:cs="Times New Roman"/>
+          <w:sz w:val="24"/>
+          <w:szCs w:val="24"/>
+          <w:lang w:eastAsia="en-IN"/>
+        </w:rPr>
+        <w:t xml:space="preserve">Set is an interface that does not allow duplicates and does not support index-based access. The actual data is stored by </w:t>
+      </w:r>
+      <w:proofErr w:type="spellStart"/>
+      <w:r>
+        <w:rPr>
+          <w:rFonts w:ascii="Times New Roman" w:eastAsia="Times New Roman" w:hAnsi="Times New Roman" w:cs="Times New Roman"/>
+          <w:sz w:val="24"/>
+          <w:szCs w:val="24"/>
+          <w:lang w:eastAsia="en-IN"/>
+        </w:rPr>
+        <w:t>HashSet</w:t>
+      </w:r>
+      <w:proofErr w:type="spellEnd"/>
+      <w:r>
+        <w:rPr>
+          <w:rFonts w:ascii="Times New Roman" w:eastAsia="Times New Roman" w:hAnsi="Times New Roman" w:cs="Times New Roman"/>
+          <w:sz w:val="24"/>
+          <w:szCs w:val="24"/>
+          <w:lang w:eastAsia="en-IN"/>
+        </w:rPr>
+        <w:t xml:space="preserve">, </w:t>
+      </w:r>
+      <w:proofErr w:type="spellStart"/>
+      <w:r>
+        <w:rPr>
+          <w:rFonts w:ascii="Times New Roman" w:eastAsia="Times New Roman" w:hAnsi="Times New Roman" w:cs="Times New Roman"/>
+          <w:sz w:val="24"/>
+          <w:szCs w:val="24"/>
+          <w:lang w:eastAsia="en-IN"/>
+        </w:rPr>
+        <w:t>LinkedHashSet</w:t>
+      </w:r>
+      <w:proofErr w:type="spellEnd"/>
+      <w:r>
+        <w:rPr>
+          <w:rFonts w:ascii="Times New Roman" w:eastAsia="Times New Roman" w:hAnsi="Times New Roman" w:cs="Times New Roman"/>
+          <w:sz w:val="24"/>
+          <w:szCs w:val="24"/>
+          <w:lang w:eastAsia="en-IN"/>
+        </w:rPr>
+        <w:t xml:space="preserve">, and </w:t>
+      </w:r>
+      <w:proofErr w:type="spellStart"/>
+      <w:r>
+        <w:rPr>
+          <w:rFonts w:ascii="Times New Roman" w:eastAsia="Times New Roman" w:hAnsi="Times New Roman" w:cs="Times New Roman"/>
+          <w:sz w:val="24"/>
+          <w:szCs w:val="24"/>
+          <w:lang w:eastAsia="en-IN"/>
+        </w:rPr>
+        <w:t>TreeSet</w:t>
+      </w:r>
+      <w:proofErr w:type="spellEnd"/>
+      <w:r>
+        <w:rPr>
+          <w:rFonts w:ascii="Times New Roman" w:eastAsia="Times New Roman" w:hAnsi="Times New Roman" w:cs="Times New Roman"/>
+          <w:sz w:val="24"/>
+          <w:szCs w:val="24"/>
+          <w:lang w:eastAsia="en-IN"/>
+        </w:rPr>
+        <w:t>.</w:t>
+      </w:r>
+    </w:p>
     <w:p/>
     <w:sectPr>
       <w:footerReference w:type="default" r:id="rId9"/>
@@ -7130,7 +7941,7 @@
           <w:rPr>
             <w:noProof/>
           </w:rPr>
-          <w:t>19</w:t>
+          <w:t>16</w:t>
         </w:r>
         <w:r>
           <w:rPr>
@@ -8223,6 +9034,155 @@
     <w:nsid w:val="5F977A0A"/>
     <w:multiLevelType w:val="multilevel"/>
     <w:tmpl w:val="4992D380"/>
+    <w:lvl w:ilvl="0">
+      <w:start w:val="1"/>
+      <w:numFmt w:val="bullet"/>
+      <w:lvlText w:val=""/>
+      <w:lvlJc w:val="left"/>
+      <w:pPr>
+        <w:tabs>
+          <w:tab w:val="num" w:pos="720"/>
+        </w:tabs>
+        <w:ind w:left="720" w:hanging="360"/>
+      </w:pPr>
+      <w:rPr>
+        <w:rFonts w:ascii="Symbol" w:hAnsi="Symbol" w:hint="default"/>
+        <w:sz w:val="20"/>
+      </w:rPr>
+    </w:lvl>
+    <w:lvl w:ilvl="1" w:tentative="1">
+      <w:start w:val="1"/>
+      <w:numFmt w:val="bullet"/>
+      <w:lvlText w:val="o"/>
+      <w:lvlJc w:val="left"/>
+      <w:pPr>
+        <w:tabs>
+          <w:tab w:val="num" w:pos="1440"/>
+        </w:tabs>
+        <w:ind w:left="1440" w:hanging="360"/>
+      </w:pPr>
+      <w:rPr>
+        <w:rFonts w:ascii="Courier New" w:hAnsi="Courier New" w:hint="default"/>
+        <w:sz w:val="20"/>
+      </w:rPr>
+    </w:lvl>
+    <w:lvl w:ilvl="2" w:tentative="1">
+      <w:start w:val="1"/>
+      <w:numFmt w:val="bullet"/>
+      <w:lvlText w:val=""/>
+      <w:lvlJc w:val="left"/>
+      <w:pPr>
+        <w:tabs>
+          <w:tab w:val="num" w:pos="2160"/>
+        </w:tabs>
+        <w:ind w:left="2160" w:hanging="360"/>
+      </w:pPr>
+      <w:rPr>
+        <w:rFonts w:ascii="Wingdings" w:hAnsi="Wingdings" w:hint="default"/>
+        <w:sz w:val="20"/>
+      </w:rPr>
+    </w:lvl>
+    <w:lvl w:ilvl="3" w:tentative="1">
+      <w:start w:val="1"/>
+      <w:numFmt w:val="bullet"/>
+      <w:lvlText w:val=""/>
+      <w:lvlJc w:val="left"/>
+      <w:pPr>
+        <w:tabs>
+          <w:tab w:val="num" w:pos="2880"/>
+        </w:tabs>
+        <w:ind w:left="2880" w:hanging="360"/>
+      </w:pPr>
+      <w:rPr>
+        <w:rFonts w:ascii="Wingdings" w:hAnsi="Wingdings" w:hint="default"/>
+        <w:sz w:val="20"/>
+      </w:rPr>
+    </w:lvl>
+    <w:lvl w:ilvl="4" w:tentative="1">
+      <w:start w:val="1"/>
+      <w:numFmt w:val="bullet"/>
+      <w:lvlText w:val=""/>
+      <w:lvlJc w:val="left"/>
+      <w:pPr>
+        <w:tabs>
+          <w:tab w:val="num" w:pos="3600"/>
+        </w:tabs>
+        <w:ind w:left="3600" w:hanging="360"/>
+      </w:pPr>
+      <w:rPr>
+        <w:rFonts w:ascii="Wingdings" w:hAnsi="Wingdings" w:hint="default"/>
+        <w:sz w:val="20"/>
+      </w:rPr>
+    </w:lvl>
+    <w:lvl w:ilvl="5" w:tentative="1">
+      <w:start w:val="1"/>
+      <w:numFmt w:val="bullet"/>
+      <w:lvlText w:val=""/>
+      <w:lvlJc w:val="left"/>
+      <w:pPr>
+        <w:tabs>
+          <w:tab w:val="num" w:pos="4320"/>
+        </w:tabs>
+        <w:ind w:left="4320" w:hanging="360"/>
+      </w:pPr>
+      <w:rPr>
+        <w:rFonts w:ascii="Wingdings" w:hAnsi="Wingdings" w:hint="default"/>
+        <w:sz w:val="20"/>
+      </w:rPr>
+    </w:lvl>
+    <w:lvl w:ilvl="6" w:tentative="1">
+      <w:start w:val="1"/>
+      <w:numFmt w:val="bullet"/>
+      <w:lvlText w:val=""/>
+      <w:lvlJc w:val="left"/>
+      <w:pPr>
+        <w:tabs>
+          <w:tab w:val="num" w:pos="5040"/>
+        </w:tabs>
+        <w:ind w:left="5040" w:hanging="360"/>
+      </w:pPr>
+      <w:rPr>
+        <w:rFonts w:ascii="Wingdings" w:hAnsi="Wingdings" w:hint="default"/>
+        <w:sz w:val="20"/>
+      </w:rPr>
+    </w:lvl>
+    <w:lvl w:ilvl="7" w:tentative="1">
+      <w:start w:val="1"/>
+      <w:numFmt w:val="bullet"/>
+      <w:lvlText w:val=""/>
+      <w:lvlJc w:val="left"/>
+      <w:pPr>
+        <w:tabs>
+          <w:tab w:val="num" w:pos="5760"/>
+        </w:tabs>
+        <w:ind w:left="5760" w:hanging="360"/>
+      </w:pPr>
+      <w:rPr>
+        <w:rFonts w:ascii="Wingdings" w:hAnsi="Wingdings" w:hint="default"/>
+        <w:sz w:val="20"/>
+      </w:rPr>
+    </w:lvl>
+    <w:lvl w:ilvl="8" w:tentative="1">
+      <w:start w:val="1"/>
+      <w:numFmt w:val="bullet"/>
+      <w:lvlText w:val=""/>
+      <w:lvlJc w:val="left"/>
+      <w:pPr>
+        <w:tabs>
+          <w:tab w:val="num" w:pos="6480"/>
+        </w:tabs>
+        <w:ind w:left="6480" w:hanging="360"/>
+      </w:pPr>
+      <w:rPr>
+        <w:rFonts w:ascii="Wingdings" w:hAnsi="Wingdings" w:hint="default"/>
+        <w:sz w:val="20"/>
+      </w:rPr>
+    </w:lvl>
+  </w:abstractNum>
+  <w:abstractNum w:abstractNumId="8">
+    <w:nsid w:val="61930F7B"/>
+    <w:multiLevelType w:val="multilevel"/>
+    <w:tmpl w:val="3ED83C4E"/>
     <w:lvl w:ilvl="0">
       <w:start w:val="1"/>
       <w:numFmt w:val="bullet"/>
@@ -8391,6 +9351,9 @@
   </w:num>
   <w:num w:numId="8">
     <w:abstractNumId w:val="4"/>
+  </w:num>
+  <w:num w:numId="9">
+    <w:abstractNumId w:val="8"/>
   </w:num>
 </w:numbering>
 </file>

</xml_diff>